<commit_message>
f208047e7e1de017dc61e4e2860670175b6dee4f deploy: siteground artifact
</commit_message>
<xml_diff>
--- a/hub/manuals/nod-admin.docx
+++ b/hub/manuals/nod-admin.docx
@@ -1984,7 +1984,7 @@
         </w:numPr>
       </w:pPr>
       <w:r>
-        <w:t xml:space="preserve">They are taken off every media list. Adding them to a media list again later doesn't ask about an unsubscribe.</w:t>
+        <w:t xml:space="preserve">They are taken off every media list. Deleting isn't an unsubscribe, so it doesn't by itself make the Hub ask when you add them to a media list later.</w:t>
       </w:r>
     </w:p>
     <w:p>
@@ -3099,7 +3099,7 @@
         <w:tc>
           <w:p>
             <w:r>
-              <w:t xml:space="preserve">The list was retired where its name is set, such as a ministry that no longer exists.</w:t>
+              <w:t xml:space="preserve">Core administrators retired it, such as a ministry that no longer exists. Its name shows "(retired)".</w:t>
             </w:r>
           </w:p>
         </w:tc>
@@ -3998,7 +3998,7 @@
         </w:numPr>
       </w:pPr>
       <w:r>
-        <w:t xml:space="preserve">If the person left this list by unsubscribing, the Hub asks "This person unsubscribed" and says when. Choose </w:t>
+        <w:t xml:space="preserve">When you add someone, the Hub may ask "This person unsubscribed" and say when. It asks only when its records show this address may have unsubscribed since it was last added to this list: from this list, from all News On Demand email, or in the old News On Demand system. Check with them, or with whoever asked you to add them, before you choose </w:t>
       </w:r>
       <w:r>
         <w:rPr>
@@ -4008,7 +4008,7 @@
         <w:t xml:space="preserve">Add anyway</w:t>
       </w:r>
       <w:r>
-        <w:t xml:space="preserve"> only if they have asked to get media releases again.</w:t>
+        <w:t xml:space="preserve">. Adding them back clears the question for this list, unless they unsubscribe again.</w:t>
       </w:r>
     </w:p>
     <w:p>
@@ -4090,7 +4090,7 @@
         <w:t xml:space="preserve">Unsubscribed or deleted</w:t>
       </w:r>
       <w:r>
-        <w:t xml:space="preserve">. You can add them back later without the unsubscribe question.</w:t>
+        <w:t xml:space="preserve">. Removing them isn't an unsubscribe, so it doesn't by itself make the Hub ask when you add them back.</w:t>
       </w:r>
     </w:p>
     <w:p>
@@ -4423,15 +4423,15 @@
         <w:pStyle w:val="Heading2"/>
       </w:pPr>
       <w:r>
-        <w:t xml:space="preserve">Left this list by unsubscribing</w:t>
-      </w:r>
-    </w:p>
-    <w:p>
-      <w:pPr>
-        <w:spacing w:after="120"/>
-      </w:pPr>
-      <w:r>
-        <w:t xml:space="preserve">This section lists people who unsubscribed from this list themselves, with when they left and whether they are </w:t>
+        <w:t xml:space="preserve">Left this list</w:t>
+      </w:r>
+    </w:p>
+    <w:p>
+      <w:pPr>
+        <w:spacing w:after="120"/>
+      </w:pPr>
+      <w:r>
+        <w:t xml:space="preserve">This section lists people who left this list, with when they left and whether they are </w:t>
       </w:r>
       <w:r>
         <w:rPr>
@@ -4441,7 +4441,7 @@
         <w:t xml:space="preserve">Back on the list</w:t>
       </w:r>
       <w:r>
-        <w:t xml:space="preserve">. The most recent 200 are shown.</w:t>
+        <w:t xml:space="preserve">. The screen explains "They unsubscribed, or left it in the old system." Someone you removed in the Hub isn't listed. The most recent 200 are shown.</w:t>
       </w:r>
     </w:p>
     <w:p>

</xml_diff>

<commit_message>
c4d6e6428e277533af2dd99a4358cd90fb5abab9 deploy: siteground artifact
</commit_message>
<xml_diff>
--- a/hub/manuals/nod-admin.docx
+++ b/hub/manuals/nod-admin.docx
@@ -3998,7 +3998,7 @@
         </w:numPr>
       </w:pPr>
       <w:r>
-        <w:t xml:space="preserve">When you add someone, the Hub may ask "This person unsubscribed" and say when. It asks only when its records show this address may have unsubscribed since it was last added to this list: from this list, from all News On Demand email, or in the old News On Demand system. Check with them, or with whoever asked you to add them, before you choose </w:t>
+        <w:t xml:space="preserve">When you add someone, the Hub may ask "This person unsubscribed" and explain "Our records show they left [when]: they unsubscribed, or left it in the old system. Add them only if they've asked to receive media releases again." It asks only when its records show this address may have unsubscribed since it was last added to this list: from this list, from all News On Demand email, or in the old News On Demand system. Check with them, or with whoever asked you to add them, before you choose </w:t>
       </w:r>
       <w:r>
         <w:rPr>
@@ -5950,7 +5950,7 @@
         <w:spacing w:after="120"/>
       </w:pPr>
       <w:r>
-        <w:t xml:space="preserve">It never deletes subscribers disabled by bounces. When it deletes someone who had left a media list by unsubscribing, it keeps that they left the list, without their address, so adding that address back still asks first.</w:t>
+        <w:t xml:space="preserve">It never deletes subscribers disabled by bounces. When it deletes someone who had left a media list, it keeps that they left the list, without their address, so adding that address back still asks first.</w:t>
       </w:r>
     </w:p>
     <w:p>

</xml_diff>

<commit_message>
47433feee516e124a0ab665a3a23e184beb0cde4 deploy: siteground artifact
</commit_message>
<xml_diff>
--- a/hub/manuals/nod-admin.docx
+++ b/hub/manuals/nod-admin.docx
@@ -76,7 +76,7 @@
           <w:sz w:val="24"/>
           <w:szCs w:val="24"/>
         </w:rPr>
-        <w:t xml:space="preserve">Software version of October 30, 2026</w:t>
+        <w:t xml:space="preserve">Software version of October 31, 2026</w:t>
       </w:r>
     </w:p>
     <w:p>
@@ -990,6 +990,187 @@
       </w:r>
       <w:r>
         <w:t xml:space="preserve"> subscriber for that release gets one email, the media version, not two.</w:t>
+      </w:r>
+    </w:p>
+    <w:p>
+      <w:pPr>
+        <w:pStyle w:val="Heading2"/>
+      </w:pPr>
+      <w:r>
+        <w:t xml:space="preserve">When a subscriber unsubscribes</w:t>
+      </w:r>
+    </w:p>
+    <w:p>
+      <w:pPr>
+        <w:spacing w:after="120"/>
+      </w:pPr>
+      <w:r>
+        <w:t xml:space="preserve">Every release, digest, alert and media list email ends with an </w:t>
+      </w:r>
+      <w:r>
+        <w:rPr>
+          <w:b/>
+          <w:bCs/>
+        </w:rPr>
+        <w:t xml:space="preserve">Unsubscribe</w:t>
+      </w:r>
+      <w:r>
+        <w:t xml:space="preserve"> link. It opens the Unsubscribe page on the public site, which asks them to confirm with its </w:t>
+      </w:r>
+      <w:r>
+        <w:rPr>
+          <w:b/>
+          <w:bCs/>
+        </w:rPr>
+        <w:t xml:space="preserve">Unsubscribe</w:t>
+      </w:r>
+      <w:r>
+        <w:t xml:space="preserve"> button. Opening the link alone changes nothing. Once they confirm, the page says "You're unsubscribed." and their status becomes </w:t>
+      </w:r>
+      <w:r>
+        <w:rPr>
+          <w:b/>
+          <w:bCs/>
+        </w:rPr>
+        <w:t xml:space="preserve">Unsubscribed or deleted</w:t>
+      </w:r>
+      <w:r>
+        <w:t xml:space="preserve">. Some email programs also show their own unsubscribe button, which unsubscribes them at once.</w:t>
+      </w:r>
+    </w:p>
+    <w:p>
+      <w:pPr>
+        <w:spacing w:after="120"/>
+      </w:pPr>
+      <w:r>
+        <w:t xml:space="preserve">If something goes wrong, the page says so:</w:t>
+      </w:r>
+    </w:p>
+    <w:tbl>
+      <w:tblPr>
+        <w:tblW w:type="pct" w:w="5000"/>
+        <w:tblBorders>
+          <w:top w:val="single" w:color="auto" w:sz="4"/>
+          <w:left w:val="single" w:color="auto" w:sz="4"/>
+          <w:bottom w:val="single" w:color="auto" w:sz="4"/>
+          <w:right w:val="single" w:color="auto" w:sz="4"/>
+          <w:insideH w:val="single" w:color="auto" w:sz="4"/>
+          <w:insideV w:val="single" w:color="auto" w:sz="4"/>
+        </w:tblBorders>
+      </w:tblPr>
+      <w:tblGrid>
+        <w:gridCol w:w="4513"/>
+        <w:gridCol w:w="4513"/>
+      </w:tblGrid>
+      <w:tr>
+        <w:trPr>
+          <w:tblHeader/>
+        </w:trPr>
+        <w:tc>
+          <w:tcPr>
+            <w:shd w:fill="E8EEF5" w:val="clear"/>
+          </w:tcPr>
+          <w:p>
+            <w:r>
+              <w:rPr>
+                <w:b/>
+                <w:bCs/>
+              </w:rPr>
+              <w:t xml:space="preserve">What the page says</w:t>
+            </w:r>
+          </w:p>
+        </w:tc>
+        <w:tc>
+          <w:tcPr>
+            <w:shd w:fill="E8EEF5" w:val="clear"/>
+          </w:tcPr>
+          <w:p>
+            <w:r>
+              <w:rPr>
+                <w:b/>
+                <w:bCs/>
+              </w:rPr>
+              <w:t xml:space="preserve">What it means</w:t>
+            </w:r>
+          </w:p>
+        </w:tc>
+      </w:tr>
+      <w:tr>
+        <w:tc>
+          <w:p>
+            <w:r>
+              <w:t xml:space="preserve">"We couldn't unsubscribe you. You're still subscribed. Try again in a few minutes."</w:t>
+            </w:r>
+          </w:p>
+        </w:tc>
+        <w:tc>
+          <w:p>
+            <w:r>
+              <w:t xml:space="preserve">Nothing changed. They can choose </w:t>
+            </w:r>
+            <w:r>
+              <w:rPr>
+                <w:b/>
+                <w:bCs/>
+              </w:rPr>
+              <w:t xml:space="preserve">Unsubscribe</w:t>
+            </w:r>
+            <w:r>
+              <w:t xml:space="preserve"> again.</w:t>
+            </w:r>
+          </w:p>
+        </w:tc>
+      </w:tr>
+      <w:tr>
+        <w:tc>
+          <w:p>
+            <w:r>
+              <w:t xml:space="preserve">"This unsubscribe link isn't complete. It may have been cut off in your email."</w:t>
+            </w:r>
+          </w:p>
+        </w:tc>
+        <w:tc>
+          <w:p>
+            <w:r>
+              <w:t xml:space="preserve">The link was cut short, which some email programs do to long links.</w:t>
+            </w:r>
+          </w:p>
+        </w:tc>
+      </w:tr>
+      <w:tr>
+        <w:tc>
+          <w:p>
+            <w:r>
+              <w:t xml:space="preserve">"This link has expired."</w:t>
+            </w:r>
+          </w:p>
+        </w:tc>
+        <w:tc>
+          <w:p>
+            <w:r>
+              <w:t xml:space="preserve">They came from the manage page, and its link lasts only 24 hours.</w:t>
+            </w:r>
+          </w:p>
+        </w:tc>
+      </w:tr>
+    </w:tbl>
+    <w:p/>
+    <w:p>
+      <w:pPr>
+        <w:spacing w:after="120"/>
+      </w:pPr>
+      <w:r>
+        <w:t xml:space="preserve">Each of these also points them to the public </w:t>
+      </w:r>
+      <w:r>
+        <w:rPr>
+          <w:b/>
+          <w:bCs/>
+        </w:rPr>
+        <w:t xml:space="preserve">Manage Subscription</w:t>
+      </w:r>
+      <w:r>
+        <w:t xml:space="preserve"> page, where they can ask for a new link by email and unsubscribe from there.</w:t>
       </w:r>
     </w:p>
     <w:p>

</xml_diff>

<commit_message>
1d04d9dda787f7e1e3e3ef8cafa352849f10b0a5 deploy: siteground artifact
</commit_message>
<xml_diff>
--- a/hub/manuals/nod-admin.docx
+++ b/hub/manuals/nod-admin.docx
@@ -2057,16 +2057,12 @@
         <w:spacing w:after="120"/>
       </w:pPr>
       <w:r>
-        <w:t xml:space="preserve">Delete when a person asks to stop all email, or when an address must be removed.</w:t>
-      </w:r>
-    </w:p>
-    <w:p>
-      <w:pPr>
-        <w:pStyle w:val="ListParagraph"/>
-        <w:numPr>
-          <w:ilvl w:val="0"/>
-          <w:numId w:val="6"/>
-        </w:numPr>
+        <w:t xml:space="preserve">Delete when a person asks to stop all email, or when a record must be removed.</w:t>
+      </w:r>
+    </w:p>
+    <w:p>
+      <w:pPr>
+        <w:spacing w:after="120"/>
       </w:pPr>
       <w:r>
         <w:t xml:space="preserve">Open their record.</w:t>
@@ -2074,11 +2070,7 @@
     </w:p>
     <w:p>
       <w:pPr>
-        <w:pStyle w:val="ListParagraph"/>
-        <w:numPr>
-          <w:ilvl w:val="0"/>
-          <w:numId w:val="6"/>
-        </w:numPr>
+        <w:spacing w:after="120"/>
       </w:pPr>
       <w:r>
         <w:t xml:space="preserve">Choose </w:t>
@@ -2096,11 +2088,71 @@
     </w:p>
     <w:p>
       <w:pPr>
-        <w:pStyle w:val="ListParagraph"/>
-        <w:numPr>
-          <w:ilvl w:val="0"/>
-          <w:numId w:val="6"/>
-        </w:numPr>
+        <w:spacing w:after="120"/>
+      </w:pPr>
+      <w:r>
+        <w:t xml:space="preserve">Under </w:t>
+      </w:r>
+      <w:r>
+        <w:rPr>
+          <w:b/>
+          <w:bCs/>
+        </w:rPr>
+        <w:t xml:space="preserve">Why are you deleting them?</w:t>
+      </w:r>
+      <w:r>
+        <w:t xml:space="preserve">, choose one:</w:t>
+      </w:r>
+    </w:p>
+    <w:p>
+      <w:pPr>
+        <w:pStyle w:val="ListParagraph"/>
+        <w:numPr>
+          <w:ilvl w:val="1"/>
+          <w:numId w:val="1"/>
+        </w:numPr>
+      </w:pPr>
+      <w:r>
+        <w:rPr>
+          <w:b/>
+          <w:bCs/>
+        </w:rPr>
+        <w:t xml:space="preserve">They asked us to stop sending them email</w:t>
+      </w:r>
+      <w:r>
+        <w:t xml:space="preserve">: for a person who phoned, wrote or emailed to say stop. The Hub explains "This is kept as their unsubscribe. If anyone adds them to a media list later, the Hub asks first."</w:t>
+      </w:r>
+    </w:p>
+    <w:p>
+      <w:pPr>
+        <w:pStyle w:val="ListParagraph"/>
+        <w:numPr>
+          <w:ilvl w:val="1"/>
+          <w:numId w:val="1"/>
+        </w:numPr>
+      </w:pPr>
+      <w:r>
+        <w:rPr>
+          <w:b/>
+          <w:bCs/>
+        </w:rPr>
+        <w:t xml:space="preserve">Something else, such as a duplicate or test record</w:t>
+      </w:r>
+      <w:r>
+        <w:t xml:space="preserve">: for cleaning up records.</w:t>
+      </w:r>
+    </w:p>
+    <w:p>
+      <w:pPr>
+        <w:spacing w:after="120"/>
+      </w:pPr>
+      <w:r>
+        <w:t xml:space="preserve">If you choose neither, you see "Choose why you’re deleting them." and nothing is deleted.</w:t>
+      </w:r>
+    </w:p>
+    <w:p>
+      <w:pPr>
+        <w:spacing w:after="120"/>
       </w:pPr>
       <w:r>
         <w:t xml:space="preserve">Choose </w:t>
@@ -2165,7 +2217,101 @@
         </w:numPr>
       </w:pPr>
       <w:r>
-        <w:t xml:space="preserve">They are taken off every media list. Deleting isn't an unsubscribe, so it doesn't by itself make the Hub ask when you add them to a media list later.</w:t>
+        <w:t xml:space="preserve">They are taken off every media list.</w:t>
+      </w:r>
+    </w:p>
+    <w:p>
+      <w:pPr>
+        <w:pStyle w:val="ListParagraph"/>
+        <w:numPr>
+          <w:ilvl w:val="0"/>
+          <w:numId w:val="1"/>
+        </w:numPr>
+      </w:pPr>
+      <w:r>
+        <w:t xml:space="preserve">With </w:t>
+      </w:r>
+      <w:r>
+        <w:rPr>
+          <w:b/>
+          <w:bCs/>
+        </w:rPr>
+        <w:t xml:space="preserve">They asked us to stop sending them email</w:t>
+      </w:r>
+      <w:r>
+        <w:t xml:space="preserve">, it counts as their unsubscribe, as if they had unsubscribed themselves. </w:t>
+      </w:r>
+      <w:r>
+        <w:rPr>
+          <w:b/>
+          <w:bCs/>
+        </w:rPr>
+        <w:t xml:space="preserve">History</w:t>
+      </w:r>
+      <w:r>
+        <w:t xml:space="preserve"> shows "Unsubscribed", with "asked staff" under </w:t>
+      </w:r>
+      <w:r>
+        <w:rPr>
+          <w:b/>
+          <w:bCs/>
+        </w:rPr>
+        <w:t xml:space="preserve">Detail</w:t>
+      </w:r>
+      <w:r>
+        <w:t xml:space="preserve">, and "Left a media list", both with your name, and they appear under </w:t>
+      </w:r>
+      <w:r>
+        <w:rPr>
+          <w:b/>
+          <w:bCs/>
+        </w:rPr>
+        <w:t xml:space="preserve">Left this list</w:t>
+      </w:r>
+      <w:r>
+        <w:t xml:space="preserve"> on each media list they were on. If anyone later adds them to any media list, the Hub asks "This person unsubscribed" first. This is kept even after the retention purge removes the record. On </w:t>
+      </w:r>
+      <w:r>
+        <w:rPr>
+          <w:b/>
+          <w:bCs/>
+        </w:rPr>
+        <w:t xml:space="preserve">Recent unsubscribes</w:t>
+      </w:r>
+      <w:r>
+        <w:t xml:space="preserve"> they show as "Unsubscribed".</w:t>
+      </w:r>
+    </w:p>
+    <w:p>
+      <w:pPr>
+        <w:pStyle w:val="ListParagraph"/>
+        <w:numPr>
+          <w:ilvl w:val="0"/>
+          <w:numId w:val="1"/>
+        </w:numPr>
+      </w:pPr>
+      <w:r>
+        <w:t xml:space="preserve">With </w:t>
+      </w:r>
+      <w:r>
+        <w:rPr>
+          <w:b/>
+          <w:bCs/>
+        </w:rPr>
+        <w:t xml:space="preserve">Something else</w:t>
+      </w:r>
+      <w:r>
+        <w:t xml:space="preserve">, deleting isn't an unsubscribe, so it doesn't by itself make the Hub ask when you add them to a media list later. </w:t>
+      </w:r>
+      <w:r>
+        <w:rPr>
+          <w:b/>
+          <w:bCs/>
+        </w:rPr>
+        <w:t xml:space="preserve">History</w:t>
+      </w:r>
+      <w:r>
+        <w:t xml:space="preserve"> shows "Deleted by staff".</w:t>
       </w:r>
     </w:p>
     <w:p>
@@ -2241,7 +2387,7 @@
         <w:pStyle w:val="ListParagraph"/>
         <w:numPr>
           <w:ilvl w:val="0"/>
-          <w:numId w:val="7"/>
+          <w:numId w:val="6"/>
         </w:numPr>
       </w:pPr>
       <w:r>
@@ -2253,7 +2399,7 @@
         <w:pStyle w:val="ListParagraph"/>
         <w:numPr>
           <w:ilvl w:val="0"/>
-          <w:numId w:val="7"/>
+          <w:numId w:val="6"/>
         </w:numPr>
       </w:pPr>
       <w:r>
@@ -2265,7 +2411,7 @@
         <w:pStyle w:val="ListParagraph"/>
         <w:numPr>
           <w:ilvl w:val="0"/>
-          <w:numId w:val="7"/>
+          <w:numId w:val="6"/>
         </w:numPr>
       </w:pPr>
       <w:r>
@@ -2307,7 +2453,7 @@
         <w:pStyle w:val="ListParagraph"/>
         <w:numPr>
           <w:ilvl w:val="0"/>
-          <w:numId w:val="7"/>
+          <w:numId w:val="6"/>
         </w:numPr>
       </w:pPr>
       <w:r>
@@ -2342,6 +2488,41 @@
       </w:r>
       <w:r>
         <w:t xml:space="preserve">.</w:t>
+      </w:r>
+    </w:p>
+    <w:p>
+      <w:pPr>
+        <w:spacing w:after="120"/>
+      </w:pPr>
+      <w:r>
+        <w:rPr>
+          <w:b/>
+          <w:bCs/>
+        </w:rPr>
+        <w:t xml:space="preserve">Delete selected</w:t>
+      </w:r>
+      <w:r>
+        <w:t xml:space="preserve"> is always the </w:t>
+      </w:r>
+      <w:r>
+        <w:rPr>
+          <w:b/>
+          <w:bCs/>
+        </w:rPr>
+        <w:t xml:space="preserve">Something else</w:t>
+      </w:r>
+      <w:r>
+        <w:t xml:space="preserve"> kind of delete. If a person asked to stop their email, delete them from their own record and choose </w:t>
+      </w:r>
+      <w:r>
+        <w:rPr>
+          <w:b/>
+          <w:bCs/>
+        </w:rPr>
+        <w:t xml:space="preserve">They asked us to stop sending them email</w:t>
+      </w:r>
+      <w:r>
+        <w:t xml:space="preserve">, so it's kept as their unsubscribe.</w:t>
       </w:r>
     </w:p>
     <w:p>
@@ -2596,7 +2777,7 @@
         <w:pStyle w:val="ListParagraph"/>
         <w:numPr>
           <w:ilvl w:val="0"/>
-          <w:numId w:val="8"/>
+          <w:numId w:val="7"/>
         </w:numPr>
       </w:pPr>
       <w:r>
@@ -2628,7 +2809,7 @@
         <w:pStyle w:val="ListParagraph"/>
         <w:numPr>
           <w:ilvl w:val="0"/>
-          <w:numId w:val="8"/>
+          <w:numId w:val="7"/>
         </w:numPr>
       </w:pPr>
       <w:r>
@@ -2660,7 +2841,7 @@
         <w:pStyle w:val="ListParagraph"/>
         <w:numPr>
           <w:ilvl w:val="0"/>
-          <w:numId w:val="8"/>
+          <w:numId w:val="7"/>
         </w:numPr>
       </w:pPr>
       <w:r>
@@ -2702,7 +2883,7 @@
         <w:pStyle w:val="ListParagraph"/>
         <w:numPr>
           <w:ilvl w:val="0"/>
-          <w:numId w:val="8"/>
+          <w:numId w:val="7"/>
         </w:numPr>
       </w:pPr>
       <w:r>
@@ -3340,41 +3521,139 @@
         <w:pStyle w:val="ListParagraph"/>
         <w:numPr>
           <w:ilvl w:val="0"/>
+          <w:numId w:val="8"/>
+        </w:numPr>
+      </w:pPr>
+      <w:r>
+        <w:t xml:space="preserve">Untick </w:t>
+      </w:r>
+      <w:r>
+        <w:rPr>
+          <w:b/>
+          <w:bCs/>
+        </w:rPr>
+        <w:t xml:space="preserve">Offer</w:t>
+      </w:r>
+      <w:r>
+        <w:t xml:space="preserve"> and the list's name, such as </w:t>
+      </w:r>
+      <w:r>
+        <w:rPr>
+          <w:b/>
+          <w:bCs/>
+        </w:rPr>
+        <w:t xml:space="preserve">Offer Seniors</w:t>
+      </w:r>
+      <w:r>
+        <w:t xml:space="preserve">, on its row. To stop a whole category, untick </w:t>
+      </w:r>
+      <w:r>
+        <w:rPr>
+          <w:b/>
+          <w:bCs/>
+        </w:rPr>
+        <w:t xml:space="preserve">Offer</w:t>
+      </w:r>
+      <w:r>
+        <w:t xml:space="preserve"> and the category's name under its heading.</w:t>
+      </w:r>
+    </w:p>
+    <w:p>
+      <w:pPr>
+        <w:pStyle w:val="ListParagraph"/>
+        <w:numPr>
+          <w:ilvl w:val="0"/>
+          <w:numId w:val="8"/>
+        </w:numPr>
+      </w:pPr>
+      <w:r>
+        <w:t xml:space="preserve">"Saved" appears beside the box. There is no question first.</w:t>
+      </w:r>
+    </w:p>
+    <w:p>
+      <w:pPr>
+        <w:spacing w:after="120"/>
+      </w:pPr>
+      <w:r>
+        <w:t xml:space="preserve">The list disappears from the public subscribe page and from the staff </w:t>
+      </w:r>
+      <w:r>
+        <w:rPr>
+          <w:b/>
+          <w:bCs/>
+        </w:rPr>
+        <w:t xml:space="preserve">Lists</w:t>
+      </w:r>
+      <w:r>
+        <w:t xml:space="preserve"> choices. People who already have it keep it, and still get its releases.</w:t>
+      </w:r>
+    </w:p>
+    <w:p>
+      <w:pPr>
+        <w:spacing w:after="120"/>
+      </w:pPr>
+      <w:r>
+        <w:t xml:space="preserve">To offer it again, tick the box again.</w:t>
+      </w:r>
+    </w:p>
+    <w:p>
+      <w:pPr>
+        <w:pStyle w:val="Heading2"/>
+      </w:pPr>
+      <w:r>
+        <w:t xml:space="preserve">Change the order</w:t>
+      </w:r>
+    </w:p>
+    <w:p>
+      <w:pPr>
+        <w:pStyle w:val="ListParagraph"/>
+        <w:numPr>
+          <w:ilvl w:val="0"/>
           <w:numId w:val="9"/>
         </w:numPr>
       </w:pPr>
       <w:r>
-        <w:t xml:space="preserve">Untick </w:t>
-      </w:r>
-      <w:r>
-        <w:rPr>
-          <w:b/>
-          <w:bCs/>
-        </w:rPr>
-        <w:t xml:space="preserve">Offer</w:t>
-      </w:r>
-      <w:r>
-        <w:t xml:space="preserve"> and the list's name, such as </w:t>
-      </w:r>
-      <w:r>
-        <w:rPr>
-          <w:b/>
-          <w:bCs/>
-        </w:rPr>
-        <w:t xml:space="preserve">Offer Seniors</w:t>
-      </w:r>
-      <w:r>
-        <w:t xml:space="preserve">, on its row. To stop a whole category, untick </w:t>
-      </w:r>
-      <w:r>
-        <w:rPr>
-          <w:b/>
-          <w:bCs/>
-        </w:rPr>
-        <w:t xml:space="preserve">Offer</w:t>
-      </w:r>
-      <w:r>
-        <w:t xml:space="preserve"> and the category's name under its heading.</w:t>
+        <w:t xml:space="preserve">Choose </w:t>
+      </w:r>
+      <w:r>
+        <w:rPr>
+          <w:b/>
+          <w:bCs/>
+        </w:rPr>
+        <w:t xml:space="preserve">Move</w:t>
+      </w:r>
+      <w:r>
+        <w:t xml:space="preserve"> and the list's name with </w:t>
+      </w:r>
+      <w:r>
+        <w:rPr>
+          <w:b/>
+          <w:bCs/>
+        </w:rPr>
+        <w:t xml:space="preserve">up</w:t>
+      </w:r>
+      <w:r>
+        <w:t xml:space="preserve"> or </w:t>
+      </w:r>
+      <w:r>
+        <w:rPr>
+          <w:b/>
+          <w:bCs/>
+        </w:rPr>
+        <w:t xml:space="preserve">down</w:t>
+      </w:r>
+      <w:r>
+        <w:t xml:space="preserve">, such as </w:t>
+      </w:r>
+      <w:r>
+        <w:rPr>
+          <w:b/>
+          <w:bCs/>
+        </w:rPr>
+        <w:t xml:space="preserve">Move Finance up</w:t>
+      </w:r>
+      <w:r>
+        <w:t xml:space="preserve">.</w:t>
       </w:r>
     </w:p>
     <w:p>
@@ -3383,104 +3662,6 @@
         <w:numPr>
           <w:ilvl w:val="0"/>
           <w:numId w:val="9"/>
-        </w:numPr>
-      </w:pPr>
-      <w:r>
-        <w:t xml:space="preserve">"Saved" appears beside the box. There is no question first.</w:t>
-      </w:r>
-    </w:p>
-    <w:p>
-      <w:pPr>
-        <w:spacing w:after="120"/>
-      </w:pPr>
-      <w:r>
-        <w:t xml:space="preserve">The list disappears from the public subscribe page and from the staff </w:t>
-      </w:r>
-      <w:r>
-        <w:rPr>
-          <w:b/>
-          <w:bCs/>
-        </w:rPr>
-        <w:t xml:space="preserve">Lists</w:t>
-      </w:r>
-      <w:r>
-        <w:t xml:space="preserve"> choices. People who already have it keep it, and still get its releases.</w:t>
-      </w:r>
-    </w:p>
-    <w:p>
-      <w:pPr>
-        <w:spacing w:after="120"/>
-      </w:pPr>
-      <w:r>
-        <w:t xml:space="preserve">To offer it again, tick the box again.</w:t>
-      </w:r>
-    </w:p>
-    <w:p>
-      <w:pPr>
-        <w:pStyle w:val="Heading2"/>
-      </w:pPr>
-      <w:r>
-        <w:t xml:space="preserve">Change the order</w:t>
-      </w:r>
-    </w:p>
-    <w:p>
-      <w:pPr>
-        <w:pStyle w:val="ListParagraph"/>
-        <w:numPr>
-          <w:ilvl w:val="0"/>
-          <w:numId w:val="10"/>
-        </w:numPr>
-      </w:pPr>
-      <w:r>
-        <w:t xml:space="preserve">Choose </w:t>
-      </w:r>
-      <w:r>
-        <w:rPr>
-          <w:b/>
-          <w:bCs/>
-        </w:rPr>
-        <w:t xml:space="preserve">Move</w:t>
-      </w:r>
-      <w:r>
-        <w:t xml:space="preserve"> and the list's name with </w:t>
-      </w:r>
-      <w:r>
-        <w:rPr>
-          <w:b/>
-          <w:bCs/>
-        </w:rPr>
-        <w:t xml:space="preserve">up</w:t>
-      </w:r>
-      <w:r>
-        <w:t xml:space="preserve"> or </w:t>
-      </w:r>
-      <w:r>
-        <w:rPr>
-          <w:b/>
-          <w:bCs/>
-        </w:rPr>
-        <w:t xml:space="preserve">down</w:t>
-      </w:r>
-      <w:r>
-        <w:t xml:space="preserve">, such as </w:t>
-      </w:r>
-      <w:r>
-        <w:rPr>
-          <w:b/>
-          <w:bCs/>
-        </w:rPr>
-        <w:t xml:space="preserve">Move Finance up</w:t>
-      </w:r>
-      <w:r>
-        <w:t xml:space="preserve">.</w:t>
-      </w:r>
-    </w:p>
-    <w:p>
-      <w:pPr>
-        <w:pStyle w:val="ListParagraph"/>
-        <w:numPr>
-          <w:ilvl w:val="0"/>
-          <w:numId w:val="10"/>
         </w:numPr>
       </w:pPr>
       <w:r>
@@ -3719,7 +3900,17 @@
         <w:t xml:space="preserve">Status</w:t>
       </w:r>
       <w:r>
-        <w:t xml:space="preserve">. A </w:t>
+        <w:t xml:space="preserve">. </w:t>
+      </w:r>
+      <w:r>
+        <w:rPr>
+          <w:b/>
+          <w:bCs/>
+        </w:rPr>
+        <w:t xml:space="preserve">Members</w:t>
+      </w:r>
+      <w:r>
+        <w:t xml:space="preserve"> counts only the members who get the list's email. Disabled members get nothing, so they aren't counted; the cell then adds, for example, "(and 2 Disabled, who get nothing)". A </w:t>
       </w:r>
       <w:r>
         <w:rPr>
@@ -3747,7 +3938,95 @@
         <w:spacing w:after="120"/>
       </w:pPr>
       <w:r>
-        <w:t xml:space="preserve">Choose a list's name to open it.</w:t>
+        <w:t xml:space="preserve">Choose a list's name to open it. Each member shows their </w:t>
+      </w:r>
+      <w:r>
+        <w:rPr>
+          <w:b/>
+          <w:bCs/>
+        </w:rPr>
+        <w:t xml:space="preserve">Email</w:t>
+      </w:r>
+      <w:r>
+        <w:t xml:space="preserve">, their </w:t>
+      </w:r>
+      <w:r>
+        <w:rPr>
+          <w:b/>
+          <w:bCs/>
+        </w:rPr>
+        <w:t xml:space="preserve">Status</w:t>
+      </w:r>
+      <w:r>
+        <w:t xml:space="preserve"> (</w:t>
+      </w:r>
+      <w:r>
+        <w:rPr>
+          <w:b/>
+          <w:bCs/>
+        </w:rPr>
+        <w:t xml:space="preserve">Active</w:t>
+      </w:r>
+      <w:r>
+        <w:t xml:space="preserve"> or </w:t>
+      </w:r>
+      <w:r>
+        <w:rPr>
+          <w:b/>
+          <w:bCs/>
+        </w:rPr>
+        <w:t xml:space="preserve">Disabled</w:t>
+      </w:r>
+      <w:r>
+        <w:t xml:space="preserve">), their </w:t>
+      </w:r>
+      <w:r>
+        <w:rPr>
+          <w:b/>
+          <w:bCs/>
+        </w:rPr>
+        <w:t xml:space="preserve">Source</w:t>
+      </w:r>
+      <w:r>
+        <w:t xml:space="preserve"> and any problem under </w:t>
+      </w:r>
+      <w:r>
+        <w:rPr>
+          <w:b/>
+          <w:bCs/>
+        </w:rPr>
+        <w:t xml:space="preserve">Needs attention</w:t>
+      </w:r>
+      <w:r>
+        <w:t xml:space="preserve">.</w:t>
+      </w:r>
+    </w:p>
+    <w:p>
+      <w:pPr>
+        <w:spacing w:after="120"/>
+      </w:pPr>
+      <w:r>
+        <w:t xml:space="preserve">Above the members, a line says how many get this list's email, for example "12 members get this list’s email. 2 more are Disabled and get nothing until someone activates them on their record." A Disabled member's </w:t>
+      </w:r>
+      <w:r>
+        <w:rPr>
+          <w:b/>
+          <w:bCs/>
+        </w:rPr>
+        <w:t xml:space="preserve">Status</w:t>
+      </w:r>
+      <w:r>
+        <w:t xml:space="preserve"> says "Disabled: gets nothing". Disabled members stay on the list but are sent nothing. To start sending to them again, open their record and choose </w:t>
+      </w:r>
+      <w:r>
+        <w:rPr>
+          <w:b/>
+          <w:bCs/>
+        </w:rPr>
+        <w:t xml:space="preserve">Activate</w:t>
+      </w:r>
+      <w:r>
+        <w:t xml:space="preserve">.</w:t>
       </w:r>
     </w:p>
     <w:p>
@@ -3763,6 +4042,110 @@
         <w:pStyle w:val="ListParagraph"/>
         <w:numPr>
           <w:ilvl w:val="0"/>
+          <w:numId w:val="10"/>
+        </w:numPr>
+      </w:pPr>
+      <w:r>
+        <w:t xml:space="preserve">Open the list.</w:t>
+      </w:r>
+    </w:p>
+    <w:p>
+      <w:pPr>
+        <w:pStyle w:val="ListParagraph"/>
+        <w:numPr>
+          <w:ilvl w:val="0"/>
+          <w:numId w:val="10"/>
+        </w:numPr>
+      </w:pPr>
+      <w:r>
+        <w:t xml:space="preserve">Under </w:t>
+      </w:r>
+      <w:r>
+        <w:rPr>
+          <w:b/>
+          <w:bCs/>
+        </w:rPr>
+        <w:t xml:space="preserve">Add from Media Hub</w:t>
+      </w:r>
+      <w:r>
+        <w:t xml:space="preserve">, type a name, email or outlet in </w:t>
+      </w:r>
+      <w:r>
+        <w:rPr>
+          <w:b/>
+          <w:bCs/>
+        </w:rPr>
+        <w:t xml:space="preserve">Name, email or outlet</w:t>
+      </w:r>
+      <w:r>
+        <w:t xml:space="preserve">.</w:t>
+      </w:r>
+    </w:p>
+    <w:p>
+      <w:pPr>
+        <w:pStyle w:val="ListParagraph"/>
+        <w:numPr>
+          <w:ilvl w:val="0"/>
+          <w:numId w:val="10"/>
+        </w:numPr>
+      </w:pPr>
+      <w:r>
+        <w:t xml:space="preserve">Choose </w:t>
+      </w:r>
+      <w:r>
+        <w:rPr>
+          <w:b/>
+          <w:bCs/>
+        </w:rPr>
+        <w:t xml:space="preserve">Search Media Hub</w:t>
+      </w:r>
+      <w:r>
+        <w:t xml:space="preserve">. Each contact shows their addresses, with the preferred one marked.</w:t>
+      </w:r>
+    </w:p>
+    <w:p>
+      <w:pPr>
+        <w:pStyle w:val="ListParagraph"/>
+        <w:numPr>
+          <w:ilvl w:val="0"/>
+          <w:numId w:val="10"/>
+        </w:numPr>
+      </w:pPr>
+      <w:r>
+        <w:t xml:space="preserve">Choose </w:t>
+      </w:r>
+      <w:r>
+        <w:rPr>
+          <w:b/>
+          <w:bCs/>
+        </w:rPr>
+        <w:t xml:space="preserve">Add</w:t>
+      </w:r>
+      <w:r>
+        <w:t xml:space="preserve"> and the address you want. You see "Added to the list."</w:t>
+      </w:r>
+    </w:p>
+    <w:p>
+      <w:pPr>
+        <w:pStyle w:val="Heading2"/>
+      </w:pPr>
+      <w:r>
+        <w:t xml:space="preserve">Add an address by hand</w:t>
+      </w:r>
+    </w:p>
+    <w:p>
+      <w:pPr>
+        <w:spacing w:after="120"/>
+      </w:pPr>
+      <w:r>
+        <w:t xml:space="preserve">Use this for people who aren't in Media Hub.</w:t>
+      </w:r>
+    </w:p>
+    <w:p>
+      <w:pPr>
+        <w:pStyle w:val="ListParagraph"/>
+        <w:numPr>
+          <w:ilvl w:val="0"/>
           <w:numId w:val="11"/>
         </w:numPr>
       </w:pPr>
@@ -3786,17 +4169,17 @@
           <w:b/>
           <w:bCs/>
         </w:rPr>
-        <w:t xml:space="preserve">Add from Media Hub</w:t>
-      </w:r>
-      <w:r>
-        <w:t xml:space="preserve">, type a name, email or outlet in </w:t>
-      </w:r>
-      <w:r>
-        <w:rPr>
-          <w:b/>
-          <w:bCs/>
-        </w:rPr>
-        <w:t xml:space="preserve">Name, email or outlet</w:t>
+        <w:t xml:space="preserve">Add an address by hand</w:t>
+      </w:r>
+      <w:r>
+        <w:t xml:space="preserve">, enter the </w:t>
+      </w:r>
+      <w:r>
+        <w:rPr>
+          <w:b/>
+          <w:bCs/>
+        </w:rPr>
+        <w:t xml:space="preserve">Email address</w:t>
       </w:r>
       <w:r>
         <w:t xml:space="preserve">.</w:t>
@@ -3818,18 +4201,330 @@
           <w:b/>
           <w:bCs/>
         </w:rPr>
-        <w:t xml:space="preserve">Search Media Hub</w:t>
-      </w:r>
-      <w:r>
-        <w:t xml:space="preserve">. Each contact shows their addresses, with the preferred one marked.</w:t>
-      </w:r>
-    </w:p>
-    <w:p>
-      <w:pPr>
-        <w:pStyle w:val="ListParagraph"/>
-        <w:numPr>
-          <w:ilvl w:val="0"/>
-          <w:numId w:val="11"/>
+        <w:t xml:space="preserve">Add to list</w:t>
+      </w:r>
+      <w:r>
+        <w:t xml:space="preserve">. You see "Added to the list."</w:t>
+      </w:r>
+    </w:p>
+    <w:p>
+      <w:pPr>
+        <w:spacing w:after="120"/>
+      </w:pPr>
+      <w:r>
+        <w:t xml:space="preserve">If the address is already on the list, you see "[their address] was already on this list." instead. If they were on it but </w:t>
+      </w:r>
+      <w:r>
+        <w:rPr>
+          <w:b/>
+          <w:bCs/>
+        </w:rPr>
+        <w:t xml:space="preserve">Disabled</w:t>
+      </w:r>
+      <w:r>
+        <w:t xml:space="preserve">, adding them again makes them </w:t>
+      </w:r>
+      <w:r>
+        <w:rPr>
+          <w:b/>
+          <w:bCs/>
+        </w:rPr>
+        <w:t xml:space="preserve">Active</w:t>
+      </w:r>
+      <w:r>
+        <w:t xml:space="preserve"> for media email, as for any Disabled address (see below), and you see "[their address] was on this list but Disabled; they’re Active again, for media email." If you added them from Media Hub and their record followed a different contact or email, it now follows the one you chose, and the message adds "Their record now follows the Media Hub contact and email you chose."</w:t>
+      </w:r>
+    </w:p>
+    <w:p>
+      <w:pPr>
+        <w:pStyle w:val="Heading2"/>
+      </w:pPr>
+      <w:r>
+        <w:t xml:space="preserve">What adding does</w:t>
+      </w:r>
+    </w:p>
+    <w:p>
+      <w:pPr>
+        <w:pStyle w:val="ListParagraph"/>
+        <w:numPr>
+          <w:ilvl w:val="0"/>
+          <w:numId w:val="1"/>
+        </w:numPr>
+      </w:pPr>
+      <w:r>
+        <w:t xml:space="preserve">The reporter is not emailed. They get the next release sent to this list.</w:t>
+      </w:r>
+    </w:p>
+    <w:p>
+      <w:pPr>
+        <w:pStyle w:val="ListParagraph"/>
+        <w:numPr>
+          <w:ilvl w:val="0"/>
+          <w:numId w:val="1"/>
+        </w:numPr>
+      </w:pPr>
+      <w:r>
+        <w:t xml:space="preserve">A new address gets a record that receives media email only.</w:t>
+      </w:r>
+    </w:p>
+    <w:p>
+      <w:pPr>
+        <w:pStyle w:val="ListParagraph"/>
+        <w:numPr>
+          <w:ilvl w:val="0"/>
+          <w:numId w:val="1"/>
+        </w:numPr>
+      </w:pPr>
+      <w:r>
+        <w:t xml:space="preserve">An address that is already </w:t>
+      </w:r>
+      <w:r>
+        <w:rPr>
+          <w:b/>
+          <w:bCs/>
+        </w:rPr>
+        <w:t xml:space="preserve">Active</w:t>
+      </w:r>
+      <w:r>
+        <w:t xml:space="preserve"> keeps its news release email as it was.</w:t>
+      </w:r>
+    </w:p>
+    <w:p>
+      <w:pPr>
+        <w:pStyle w:val="ListParagraph"/>
+        <w:numPr>
+          <w:ilvl w:val="0"/>
+          <w:numId w:val="1"/>
+        </w:numPr>
+      </w:pPr>
+      <w:r>
+        <w:t xml:space="preserve">If the address already has a record that is </w:t>
+      </w:r>
+      <w:r>
+        <w:rPr>
+          <w:b/>
+          <w:bCs/>
+        </w:rPr>
+        <w:t xml:space="preserve">Disabled</w:t>
+      </w:r>
+      <w:r>
+        <w:t xml:space="preserve"> or </w:t>
+      </w:r>
+      <w:r>
+        <w:rPr>
+          <w:b/>
+          <w:bCs/>
+        </w:rPr>
+        <w:t xml:space="preserve">Unsubscribed or deleted</w:t>
+      </w:r>
+      <w:r>
+        <w:t xml:space="preserve">, adding makes it </w:t>
+      </w:r>
+      <w:r>
+        <w:rPr>
+          <w:b/>
+          <w:bCs/>
+        </w:rPr>
+        <w:t xml:space="preserve">Active</w:t>
+      </w:r>
+      <w:r>
+        <w:t xml:space="preserve"> again, for media email only. </w:t>
+      </w:r>
+      <w:r>
+        <w:rPr>
+          <w:b/>
+          <w:bCs/>
+        </w:rPr>
+        <w:t xml:space="preserve">As it happens</w:t>
+      </w:r>
+      <w:r>
+        <w:t xml:space="preserve">, </w:t>
+      </w:r>
+      <w:r>
+        <w:rPr>
+          <w:b/>
+          <w:bCs/>
+        </w:rPr>
+        <w:t xml:space="preserve">Daily digest</w:t>
+      </w:r>
+      <w:r>
+        <w:t xml:space="preserve"> and their news lists are switched off. Media lists they were already on are kept.</w:t>
+      </w:r>
+    </w:p>
+    <w:p>
+      <w:pPr>
+        <w:pStyle w:val="ListParagraph"/>
+        <w:numPr>
+          <w:ilvl w:val="0"/>
+          <w:numId w:val="1"/>
+        </w:numPr>
+      </w:pPr>
+      <w:r>
+        <w:t xml:space="preserve">For a </w:t>
+      </w:r>
+      <w:r>
+        <w:rPr>
+          <w:b/>
+          <w:bCs/>
+        </w:rPr>
+        <w:t xml:space="preserve">Disabled</w:t>
+      </w:r>
+      <w:r>
+        <w:t xml:space="preserve"> person, their bounce count starts again, and </w:t>
+      </w:r>
+      <w:r>
+        <w:rPr>
+          <w:b/>
+          <w:bCs/>
+        </w:rPr>
+        <w:t xml:space="preserve">History</w:t>
+      </w:r>
+      <w:r>
+        <w:t xml:space="preserve"> shows "Added to a media list while Disabled. News release email stays off", with what was switched off under </w:t>
+      </w:r>
+      <w:r>
+        <w:rPr>
+          <w:b/>
+          <w:bCs/>
+        </w:rPr>
+        <w:t xml:space="preserve">Detail</w:t>
+      </w:r>
+      <w:r>
+        <w:t xml:space="preserve">.</w:t>
+      </w:r>
+    </w:p>
+    <w:p>
+      <w:pPr>
+        <w:pStyle w:val="ListParagraph"/>
+        <w:numPr>
+          <w:ilvl w:val="0"/>
+          <w:numId w:val="1"/>
+        </w:numPr>
+      </w:pPr>
+      <w:r>
+        <w:t xml:space="preserve">When the address was </w:t>
+      </w:r>
+      <w:r>
+        <w:rPr>
+          <w:b/>
+          <w:bCs/>
+        </w:rPr>
+        <w:t xml:space="preserve">Disabled</w:t>
+      </w:r>
+      <w:r>
+        <w:t xml:space="preserve">, you see "Added to the list. Their news release email stays off; open their record to turn it on." instead of "Added to the list."</w:t>
+      </w:r>
+    </w:p>
+    <w:p>
+      <w:pPr>
+        <w:pStyle w:val="ListParagraph"/>
+        <w:numPr>
+          <w:ilvl w:val="0"/>
+          <w:numId w:val="1"/>
+        </w:numPr>
+      </w:pPr>
+      <w:r>
+        <w:t xml:space="preserve">If a </w:t>
+      </w:r>
+      <w:r>
+        <w:rPr>
+          <w:b/>
+          <w:bCs/>
+        </w:rPr>
+        <w:t xml:space="preserve">Disabled</w:t>
+      </w:r>
+      <w:r>
+        <w:t xml:space="preserve"> person also wants news release email again, choose </w:t>
+      </w:r>
+      <w:r>
+        <w:rPr>
+          <w:b/>
+          <w:bCs/>
+        </w:rPr>
+        <w:t xml:space="preserve">open their record</w:t>
+      </w:r>
+      <w:r>
+        <w:t xml:space="preserve"> in that message. Tick </w:t>
+      </w:r>
+      <w:r>
+        <w:rPr>
+          <w:b/>
+          <w:bCs/>
+        </w:rPr>
+        <w:t xml:space="preserve">As it happens</w:t>
+      </w:r>
+      <w:r>
+        <w:t xml:space="preserve"> or </w:t>
+      </w:r>
+      <w:r>
+        <w:rPr>
+          <w:b/>
+          <w:bCs/>
+        </w:rPr>
+        <w:t xml:space="preserve">Daily digest</w:t>
+      </w:r>
+      <w:r>
+        <w:t xml:space="preserve"> and their lists, then choose </w:t>
+      </w:r>
+      <w:r>
+        <w:rPr>
+          <w:b/>
+          <w:bCs/>
+        </w:rPr>
+        <w:t xml:space="preserve">Save preferences</w:t>
+      </w:r>
+      <w:r>
+        <w:t xml:space="preserve">.</w:t>
+      </w:r>
+    </w:p>
+    <w:p>
+      <w:pPr>
+        <w:pStyle w:val="ListParagraph"/>
+        <w:numPr>
+          <w:ilvl w:val="0"/>
+          <w:numId w:val="1"/>
+        </w:numPr>
+      </w:pPr>
+      <w:r>
+        <w:t xml:space="preserve">When you add someone, the Hub may ask "This person unsubscribed" and explain "Our records show they left [when]: they unsubscribed, asked staff to stop their email, or left it in the old system. Add them only if they've asked to receive media releases again." It asks only when its records show this address may have unsubscribed since it was last added to this list: from this list, from all News On Demand email, or in the old News On Demand system. Check with them, or with whoever asked you to add them, before you choose </w:t>
+      </w:r>
+      <w:r>
+        <w:rPr>
+          <w:b/>
+          <w:bCs/>
+        </w:rPr>
+        <w:t xml:space="preserve">Add anyway</w:t>
+      </w:r>
+      <w:r>
+        <w:t xml:space="preserve">. Adding them back clears the question for this list, unless they unsubscribe again.</w:t>
+      </w:r>
+    </w:p>
+    <w:p>
+      <w:pPr>
+        <w:pStyle w:val="Heading2"/>
+      </w:pPr>
+      <w:r>
+        <w:t xml:space="preserve">Remove a reporter</w:t>
+      </w:r>
+    </w:p>
+    <w:p>
+      <w:pPr>
+        <w:pStyle w:val="ListParagraph"/>
+        <w:numPr>
+          <w:ilvl w:val="0"/>
+          <w:numId w:val="12"/>
+        </w:numPr>
+      </w:pPr>
+      <w:r>
+        <w:t xml:space="preserve">Open the list.</w:t>
+      </w:r>
+    </w:p>
+    <w:p>
+      <w:pPr>
+        <w:pStyle w:val="ListParagraph"/>
+        <w:numPr>
+          <w:ilvl w:val="0"/>
+          <w:numId w:val="12"/>
         </w:numPr>
       </w:pPr>
       <w:r>
@@ -3840,26 +4535,10 @@
           <w:b/>
           <w:bCs/>
         </w:rPr>
-        <w:t xml:space="preserve">Add</w:t>
-      </w:r>
-      <w:r>
-        <w:t xml:space="preserve"> and the address you want. You see "Added to the list."</w:t>
-      </w:r>
-    </w:p>
-    <w:p>
-      <w:pPr>
-        <w:pStyle w:val="Heading2"/>
-      </w:pPr>
-      <w:r>
-        <w:t xml:space="preserve">Add an address by hand</w:t>
-      </w:r>
-    </w:p>
-    <w:p>
-      <w:pPr>
-        <w:spacing w:after="120"/>
-      </w:pPr>
-      <w:r>
-        <w:t xml:space="preserve">Use this for people who aren't in Media Hub.</w:t>
+        <w:t xml:space="preserve">Remove</w:t>
+      </w:r>
+      <w:r>
+        <w:t xml:space="preserve"> and their address on their row. The Hub asks "Remove [their address] from this list?" and explains "If this is their last list and they were added only for media lists, they stop receiving email altogether."</w:t>
       </w:r>
     </w:p>
     <w:p>
@@ -3868,378 +4547,6 @@
         <w:numPr>
           <w:ilvl w:val="0"/>
           <w:numId w:val="12"/>
-        </w:numPr>
-      </w:pPr>
-      <w:r>
-        <w:t xml:space="preserve">Open the list.</w:t>
-      </w:r>
-    </w:p>
-    <w:p>
-      <w:pPr>
-        <w:pStyle w:val="ListParagraph"/>
-        <w:numPr>
-          <w:ilvl w:val="0"/>
-          <w:numId w:val="12"/>
-        </w:numPr>
-      </w:pPr>
-      <w:r>
-        <w:t xml:space="preserve">Under </w:t>
-      </w:r>
-      <w:r>
-        <w:rPr>
-          <w:b/>
-          <w:bCs/>
-        </w:rPr>
-        <w:t xml:space="preserve">Add an address by hand</w:t>
-      </w:r>
-      <w:r>
-        <w:t xml:space="preserve">, enter the </w:t>
-      </w:r>
-      <w:r>
-        <w:rPr>
-          <w:b/>
-          <w:bCs/>
-        </w:rPr>
-        <w:t xml:space="preserve">Email address</w:t>
-      </w:r>
-      <w:r>
-        <w:t xml:space="preserve">.</w:t>
-      </w:r>
-    </w:p>
-    <w:p>
-      <w:pPr>
-        <w:pStyle w:val="ListParagraph"/>
-        <w:numPr>
-          <w:ilvl w:val="0"/>
-          <w:numId w:val="12"/>
-        </w:numPr>
-      </w:pPr>
-      <w:r>
-        <w:t xml:space="preserve">Choose </w:t>
-      </w:r>
-      <w:r>
-        <w:rPr>
-          <w:b/>
-          <w:bCs/>
-        </w:rPr>
-        <w:t xml:space="preserve">Add to list</w:t>
-      </w:r>
-      <w:r>
-        <w:t xml:space="preserve">. You see "Added to the list."</w:t>
-      </w:r>
-    </w:p>
-    <w:p>
-      <w:pPr>
-        <w:pStyle w:val="Heading2"/>
-      </w:pPr>
-      <w:r>
-        <w:t xml:space="preserve">What adding does</w:t>
-      </w:r>
-    </w:p>
-    <w:p>
-      <w:pPr>
-        <w:pStyle w:val="ListParagraph"/>
-        <w:numPr>
-          <w:ilvl w:val="0"/>
-          <w:numId w:val="1"/>
-        </w:numPr>
-      </w:pPr>
-      <w:r>
-        <w:t xml:space="preserve">The reporter is not emailed. They get the next release sent to this list.</w:t>
-      </w:r>
-    </w:p>
-    <w:p>
-      <w:pPr>
-        <w:pStyle w:val="ListParagraph"/>
-        <w:numPr>
-          <w:ilvl w:val="0"/>
-          <w:numId w:val="1"/>
-        </w:numPr>
-      </w:pPr>
-      <w:r>
-        <w:t xml:space="preserve">A new address gets a record that receives media email only.</w:t>
-      </w:r>
-    </w:p>
-    <w:p>
-      <w:pPr>
-        <w:pStyle w:val="ListParagraph"/>
-        <w:numPr>
-          <w:ilvl w:val="0"/>
-          <w:numId w:val="1"/>
-        </w:numPr>
-      </w:pPr>
-      <w:r>
-        <w:t xml:space="preserve">An address that is already </w:t>
-      </w:r>
-      <w:r>
-        <w:rPr>
-          <w:b/>
-          <w:bCs/>
-        </w:rPr>
-        <w:t xml:space="preserve">Active</w:t>
-      </w:r>
-      <w:r>
-        <w:t xml:space="preserve"> keeps its news release email as it was.</w:t>
-      </w:r>
-    </w:p>
-    <w:p>
-      <w:pPr>
-        <w:pStyle w:val="ListParagraph"/>
-        <w:numPr>
-          <w:ilvl w:val="0"/>
-          <w:numId w:val="1"/>
-        </w:numPr>
-      </w:pPr>
-      <w:r>
-        <w:t xml:space="preserve">If the address already has a record that is </w:t>
-      </w:r>
-      <w:r>
-        <w:rPr>
-          <w:b/>
-          <w:bCs/>
-        </w:rPr>
-        <w:t xml:space="preserve">Disabled</w:t>
-      </w:r>
-      <w:r>
-        <w:t xml:space="preserve"> or </w:t>
-      </w:r>
-      <w:r>
-        <w:rPr>
-          <w:b/>
-          <w:bCs/>
-        </w:rPr>
-        <w:t xml:space="preserve">Unsubscribed or deleted</w:t>
-      </w:r>
-      <w:r>
-        <w:t xml:space="preserve">, adding makes it </w:t>
-      </w:r>
-      <w:r>
-        <w:rPr>
-          <w:b/>
-          <w:bCs/>
-        </w:rPr>
-        <w:t xml:space="preserve">Active</w:t>
-      </w:r>
-      <w:r>
-        <w:t xml:space="preserve"> again, for media email only. </w:t>
-      </w:r>
-      <w:r>
-        <w:rPr>
-          <w:b/>
-          <w:bCs/>
-        </w:rPr>
-        <w:t xml:space="preserve">As it happens</w:t>
-      </w:r>
-      <w:r>
-        <w:t xml:space="preserve">, </w:t>
-      </w:r>
-      <w:r>
-        <w:rPr>
-          <w:b/>
-          <w:bCs/>
-        </w:rPr>
-        <w:t xml:space="preserve">Daily digest</w:t>
-      </w:r>
-      <w:r>
-        <w:t xml:space="preserve"> and their news lists are switched off. Media lists they were already on are kept.</w:t>
-      </w:r>
-    </w:p>
-    <w:p>
-      <w:pPr>
-        <w:pStyle w:val="ListParagraph"/>
-        <w:numPr>
-          <w:ilvl w:val="0"/>
-          <w:numId w:val="1"/>
-        </w:numPr>
-      </w:pPr>
-      <w:r>
-        <w:t xml:space="preserve">For a </w:t>
-      </w:r>
-      <w:r>
-        <w:rPr>
-          <w:b/>
-          <w:bCs/>
-        </w:rPr>
-        <w:t xml:space="preserve">Disabled</w:t>
-      </w:r>
-      <w:r>
-        <w:t xml:space="preserve"> person, their bounce count starts again, and </w:t>
-      </w:r>
-      <w:r>
-        <w:rPr>
-          <w:b/>
-          <w:bCs/>
-        </w:rPr>
-        <w:t xml:space="preserve">History</w:t>
-      </w:r>
-      <w:r>
-        <w:t xml:space="preserve"> shows "Added to a media list while Disabled. News release email stays off", with what was switched off under </w:t>
-      </w:r>
-      <w:r>
-        <w:rPr>
-          <w:b/>
-          <w:bCs/>
-        </w:rPr>
-        <w:t xml:space="preserve">Detail</w:t>
-      </w:r>
-      <w:r>
-        <w:t xml:space="preserve">.</w:t>
-      </w:r>
-    </w:p>
-    <w:p>
-      <w:pPr>
-        <w:pStyle w:val="ListParagraph"/>
-        <w:numPr>
-          <w:ilvl w:val="0"/>
-          <w:numId w:val="1"/>
-        </w:numPr>
-      </w:pPr>
-      <w:r>
-        <w:t xml:space="preserve">When the address was </w:t>
-      </w:r>
-      <w:r>
-        <w:rPr>
-          <w:b/>
-          <w:bCs/>
-        </w:rPr>
-        <w:t xml:space="preserve">Disabled</w:t>
-      </w:r>
-      <w:r>
-        <w:t xml:space="preserve">, you see "Added to the list. Their news release email stays off; open their record to turn it on." instead of "Added to the list."</w:t>
-      </w:r>
-    </w:p>
-    <w:p>
-      <w:pPr>
-        <w:pStyle w:val="ListParagraph"/>
-        <w:numPr>
-          <w:ilvl w:val="0"/>
-          <w:numId w:val="1"/>
-        </w:numPr>
-      </w:pPr>
-      <w:r>
-        <w:t xml:space="preserve">If a </w:t>
-      </w:r>
-      <w:r>
-        <w:rPr>
-          <w:b/>
-          <w:bCs/>
-        </w:rPr>
-        <w:t xml:space="preserve">Disabled</w:t>
-      </w:r>
-      <w:r>
-        <w:t xml:space="preserve"> person also wants news release email again, choose </w:t>
-      </w:r>
-      <w:r>
-        <w:rPr>
-          <w:b/>
-          <w:bCs/>
-        </w:rPr>
-        <w:t xml:space="preserve">open their record</w:t>
-      </w:r>
-      <w:r>
-        <w:t xml:space="preserve"> in that message. Tick </w:t>
-      </w:r>
-      <w:r>
-        <w:rPr>
-          <w:b/>
-          <w:bCs/>
-        </w:rPr>
-        <w:t xml:space="preserve">As it happens</w:t>
-      </w:r>
-      <w:r>
-        <w:t xml:space="preserve"> or </w:t>
-      </w:r>
-      <w:r>
-        <w:rPr>
-          <w:b/>
-          <w:bCs/>
-        </w:rPr>
-        <w:t xml:space="preserve">Daily digest</w:t>
-      </w:r>
-      <w:r>
-        <w:t xml:space="preserve"> and their lists, then choose </w:t>
-      </w:r>
-      <w:r>
-        <w:rPr>
-          <w:b/>
-          <w:bCs/>
-        </w:rPr>
-        <w:t xml:space="preserve">Save preferences</w:t>
-      </w:r>
-      <w:r>
-        <w:t xml:space="preserve">.</w:t>
-      </w:r>
-    </w:p>
-    <w:p>
-      <w:pPr>
-        <w:pStyle w:val="ListParagraph"/>
-        <w:numPr>
-          <w:ilvl w:val="0"/>
-          <w:numId w:val="1"/>
-        </w:numPr>
-      </w:pPr>
-      <w:r>
-        <w:t xml:space="preserve">When you add someone, the Hub may ask "This person unsubscribed" and explain "Our records show they left [when]: they unsubscribed, or left it in the old system. Add them only if they've asked to receive media releases again." It asks only when its records show this address may have unsubscribed since it was last added to this list: from this list, from all News On Demand email, or in the old News On Demand system. Check with them, or with whoever asked you to add them, before you choose </w:t>
-      </w:r>
-      <w:r>
-        <w:rPr>
-          <w:b/>
-          <w:bCs/>
-        </w:rPr>
-        <w:t xml:space="preserve">Add anyway</w:t>
-      </w:r>
-      <w:r>
-        <w:t xml:space="preserve">. Adding them back clears the question for this list, unless they unsubscribe again.</w:t>
-      </w:r>
-    </w:p>
-    <w:p>
-      <w:pPr>
-        <w:pStyle w:val="Heading2"/>
-      </w:pPr>
-      <w:r>
-        <w:t xml:space="preserve">Remove a reporter</w:t>
-      </w:r>
-    </w:p>
-    <w:p>
-      <w:pPr>
-        <w:pStyle w:val="ListParagraph"/>
-        <w:numPr>
-          <w:ilvl w:val="0"/>
-          <w:numId w:val="13"/>
-        </w:numPr>
-      </w:pPr>
-      <w:r>
-        <w:t xml:space="preserve">Open the list.</w:t>
-      </w:r>
-    </w:p>
-    <w:p>
-      <w:pPr>
-        <w:pStyle w:val="ListParagraph"/>
-        <w:numPr>
-          <w:ilvl w:val="0"/>
-          <w:numId w:val="13"/>
-        </w:numPr>
-      </w:pPr>
-      <w:r>
-        <w:t xml:space="preserve">Choose </w:t>
-      </w:r>
-      <w:r>
-        <w:rPr>
-          <w:b/>
-          <w:bCs/>
-        </w:rPr>
-        <w:t xml:space="preserve">Remove</w:t>
-      </w:r>
-      <w:r>
-        <w:t xml:space="preserve"> and their address on their row. The Hub asks "Remove [their address] from this list?" and explains "If this is their last list and they were added only for media lists, they stop receiving email altogether."</w:t>
-      </w:r>
-    </w:p>
-    <w:p>
-      <w:pPr>
-        <w:pStyle w:val="ListParagraph"/>
-        <w:numPr>
-          <w:ilvl w:val="0"/>
-          <w:numId w:val="13"/>
         </w:numPr>
       </w:pPr>
       <w:r>
@@ -4464,11 +4771,95 @@
         <w:pStyle w:val="ListParagraph"/>
         <w:numPr>
           <w:ilvl w:val="0"/>
+          <w:numId w:val="13"/>
+        </w:numPr>
+      </w:pPr>
+      <w:r>
+        <w:t xml:space="preserve">Check with Media Relations that their mailbox works again.</w:t>
+      </w:r>
+    </w:p>
+    <w:p>
+      <w:pPr>
+        <w:pStyle w:val="ListParagraph"/>
+        <w:numPr>
+          <w:ilvl w:val="0"/>
+          <w:numId w:val="13"/>
+        </w:numPr>
+      </w:pPr>
+      <w:r>
+        <w:t xml:space="preserve">Choose </w:t>
+      </w:r>
+      <w:r>
+        <w:rPr>
+          <w:b/>
+          <w:bCs/>
+        </w:rPr>
+        <w:t xml:space="preserve">Resolve</w:t>
+      </w:r>
+      <w:r>
+        <w:t xml:space="preserve"> and their address. The Hub asks "Clear the bouncing flag?"</w:t>
+      </w:r>
+    </w:p>
+    <w:p>
+      <w:pPr>
+        <w:pStyle w:val="ListParagraph"/>
+        <w:numPr>
+          <w:ilvl w:val="0"/>
+          <w:numId w:val="13"/>
+        </w:numPr>
+      </w:pPr>
+      <w:r>
+        <w:t xml:space="preserve">Choose </w:t>
+      </w:r>
+      <w:r>
+        <w:rPr>
+          <w:b/>
+          <w:bCs/>
+        </w:rPr>
+        <w:t xml:space="preserve">Clear flag</w:t>
+      </w:r>
+      <w:r>
+        <w:t xml:space="preserve">. You see "Resolved. Their bounce count starts again."</w:t>
+      </w:r>
+    </w:p>
+    <w:p>
+      <w:pPr>
+        <w:spacing w:after="120"/>
+      </w:pPr>
+      <w:r>
+        <w:t xml:space="preserve">To fix a Media Hub problem:</w:t>
+      </w:r>
+    </w:p>
+    <w:p>
+      <w:pPr>
+        <w:pStyle w:val="ListParagraph"/>
+        <w:numPr>
+          <w:ilvl w:val="0"/>
           <w:numId w:val="14"/>
         </w:numPr>
       </w:pPr>
       <w:r>
-        <w:t xml:space="preserve">Check with Media Relations that their mailbox works again.</w:t>
+        <w:t xml:space="preserve">Choose </w:t>
+      </w:r>
+      <w:r>
+        <w:rPr>
+          <w:b/>
+          <w:bCs/>
+        </w:rPr>
+        <w:t xml:space="preserve">Resolve</w:t>
+      </w:r>
+      <w:r>
+        <w:t xml:space="preserve"> and their address. </w:t>
+      </w:r>
+      <w:r>
+        <w:rPr>
+          <w:b/>
+          <w:bCs/>
+        </w:rPr>
+        <w:t xml:space="preserve">Resolve this member</w:t>
+      </w:r>
+      <w:r>
+        <w:t xml:space="preserve"> shows their Media Hub addresses.</w:t>
       </w:r>
     </w:p>
     <w:p>
@@ -4480,17 +4871,17 @@
         </w:numPr>
       </w:pPr>
       <w:r>
-        <w:t xml:space="preserve">Choose </w:t>
-      </w:r>
-      <w:r>
-        <w:rPr>
-          <w:b/>
-          <w:bCs/>
-        </w:rPr>
-        <w:t xml:space="preserve">Resolve</w:t>
-      </w:r>
-      <w:r>
-        <w:t xml:space="preserve"> and their address. The Hub asks "Clear the bouncing flag?"</w:t>
+        <w:t xml:space="preserve">Choose the address to use, then </w:t>
+      </w:r>
+      <w:r>
+        <w:rPr>
+          <w:b/>
+          <w:bCs/>
+        </w:rPr>
+        <w:t xml:space="preserve">Use this email</w:t>
+      </w:r>
+      <w:r>
+        <w:t xml:space="preserve">. You see "Email updated and flag cleared."</w:t>
       </w:r>
     </w:p>
     <w:p>
@@ -4502,90 +4893,6 @@
         </w:numPr>
       </w:pPr>
       <w:r>
-        <w:t xml:space="preserve">Choose </w:t>
-      </w:r>
-      <w:r>
-        <w:rPr>
-          <w:b/>
-          <w:bCs/>
-        </w:rPr>
-        <w:t xml:space="preserve">Clear flag</w:t>
-      </w:r>
-      <w:r>
-        <w:t xml:space="preserve">. You see "Resolved. Their bounce count starts again."</w:t>
-      </w:r>
-    </w:p>
-    <w:p>
-      <w:pPr>
-        <w:spacing w:after="120"/>
-      </w:pPr>
-      <w:r>
-        <w:t xml:space="preserve">To fix a Media Hub problem:</w:t>
-      </w:r>
-    </w:p>
-    <w:p>
-      <w:pPr>
-        <w:pStyle w:val="ListParagraph"/>
-        <w:numPr>
-          <w:ilvl w:val="0"/>
-          <w:numId w:val="15"/>
-        </w:numPr>
-      </w:pPr>
-      <w:r>
-        <w:t xml:space="preserve">Choose </w:t>
-      </w:r>
-      <w:r>
-        <w:rPr>
-          <w:b/>
-          <w:bCs/>
-        </w:rPr>
-        <w:t xml:space="preserve">Resolve</w:t>
-      </w:r>
-      <w:r>
-        <w:t xml:space="preserve"> and their address. </w:t>
-      </w:r>
-      <w:r>
-        <w:rPr>
-          <w:b/>
-          <w:bCs/>
-        </w:rPr>
-        <w:t xml:space="preserve">Resolve this member</w:t>
-      </w:r>
-      <w:r>
-        <w:t xml:space="preserve"> shows their Media Hub addresses.</w:t>
-      </w:r>
-    </w:p>
-    <w:p>
-      <w:pPr>
-        <w:pStyle w:val="ListParagraph"/>
-        <w:numPr>
-          <w:ilvl w:val="0"/>
-          <w:numId w:val="15"/>
-        </w:numPr>
-      </w:pPr>
-      <w:r>
-        <w:t xml:space="preserve">Choose the address to use, then </w:t>
-      </w:r>
-      <w:r>
-        <w:rPr>
-          <w:b/>
-          <w:bCs/>
-        </w:rPr>
-        <w:t xml:space="preserve">Use this email</w:t>
-      </w:r>
-      <w:r>
-        <w:t xml:space="preserve">. You see "Email updated and flag cleared."</w:t>
-      </w:r>
-    </w:p>
-    <w:p>
-      <w:pPr>
-        <w:pStyle w:val="ListParagraph"/>
-        <w:numPr>
-          <w:ilvl w:val="0"/>
-          <w:numId w:val="15"/>
-        </w:numPr>
-      </w:pPr>
-      <w:r>
         <w:t xml:space="preserve">Or choose </w:t>
       </w:r>
       <w:r>
@@ -4622,7 +4929,7 @@
         <w:t xml:space="preserve">Back on the list</w:t>
       </w:r>
       <w:r>
-        <w:t xml:space="preserve">. The screen explains "They unsubscribed, or left it in the old system." Someone you removed in the Hub isn't listed. The most recent 200 are shown.</w:t>
+        <w:t xml:space="preserve">. The screen explains "They unsubscribed, asked staff to stop their email, or left it in the old system." Someone you removed from the list, or deleted for another reason, isn't listed. The most recent 200 are shown.</w:t>
       </w:r>
     </w:p>
     <w:p>
@@ -5105,7 +5412,7 @@
         <w:pStyle w:val="ListParagraph"/>
         <w:numPr>
           <w:ilvl w:val="0"/>
-          <w:numId w:val="16"/>
+          <w:numId w:val="15"/>
         </w:numPr>
       </w:pPr>
       <w:r>
@@ -5137,7 +5444,7 @@
         <w:pStyle w:val="ListParagraph"/>
         <w:numPr>
           <w:ilvl w:val="0"/>
-          <w:numId w:val="16"/>
+          <w:numId w:val="15"/>
         </w:numPr>
       </w:pPr>
       <w:r>
@@ -5307,7 +5614,17 @@
         <w:t xml:space="preserve">Not sent</w:t>
       </w:r>
       <w:r>
-        <w:t xml:space="preserve"> means not yet handed off, including a send still going out.</w:t>
+        <w:t xml:space="preserve"> means not yet handed off: a send still going out, held while News On Demand sending is paused, failed, or cancelled on </w:t>
+      </w:r>
+      <w:r>
+        <w:rPr>
+          <w:b/>
+          <w:bCs/>
+        </w:rPr>
+        <w:t xml:space="preserve">Operations</w:t>
+      </w:r>
+      <w:r>
+        <w:t xml:space="preserve">.</w:t>
       </w:r>
     </w:p>
     <w:p>
@@ -5593,7 +5910,7 @@
         <w:t xml:space="preserve">Operations</w:t>
       </w:r>
       <w:r>
-        <w:t xml:space="preserve"> stops and starts outgoing email, sets who gets the daily bounce summary, and controls the retention purge. Only Subscribers administrators see it.</w:t>
+        <w:t xml:space="preserve"> stops and starts outgoing email, shows news email that is held or failed, sets who gets the daily bounce summary, and controls the retention purge. Only Subscribers administrators see it.</w:t>
       </w:r>
     </w:p>
     <w:p>
@@ -5617,10 +5934,170 @@
         <w:pStyle w:val="ListParagraph"/>
         <w:numPr>
           <w:ilvl w:val="0"/>
+          <w:numId w:val="16"/>
+        </w:numPr>
+      </w:pPr>
+      <w:r>
+        <w:t xml:space="preserve">Under </w:t>
+      </w:r>
+      <w:r>
+        <w:rPr>
+          <w:b/>
+          <w:bCs/>
+        </w:rPr>
+        <w:t xml:space="preserve">News On Demand sending</w:t>
+      </w:r>
+      <w:r>
+        <w:t xml:space="preserve">, choose </w:t>
+      </w:r>
+      <w:r>
+        <w:rPr>
+          <w:b/>
+          <w:bCs/>
+        </w:rPr>
+        <w:t xml:space="preserve">Pause News On Demand sending</w:t>
+      </w:r>
+      <w:r>
+        <w:t xml:space="preserve">. The Hub asks "Pause News On Demand sending?" and explains "News On Demand keeps recording releases and building emails but holds them until you resume. Nothing is dropped." and says who is emailed about it.</w:t>
+      </w:r>
+    </w:p>
+    <w:p>
+      <w:pPr>
+        <w:pStyle w:val="ListParagraph"/>
+        <w:numPr>
+          <w:ilvl w:val="0"/>
+          <w:numId w:val="16"/>
+        </w:numPr>
+      </w:pPr>
+      <w:r>
+        <w:t xml:space="preserve">Choose </w:t>
+      </w:r>
+      <w:r>
+        <w:rPr>
+          <w:b/>
+          <w:bCs/>
+        </w:rPr>
+        <w:t xml:space="preserve">Confirm pause</w:t>
+      </w:r>
+      <w:r>
+        <w:t xml:space="preserve">. You see "News On Demand sending paused." and the section shows </w:t>
+      </w:r>
+      <w:r>
+        <w:rPr>
+          <w:b/>
+          <w:bCs/>
+        </w:rPr>
+        <w:t xml:space="preserve">Paused</w:t>
+      </w:r>
+      <w:r>
+        <w:t xml:space="preserve">.</w:t>
+      </w:r>
+    </w:p>
+    <w:p>
+      <w:pPr>
+        <w:spacing w:after="120"/>
+      </w:pPr>
+      <w:r>
+        <w:t xml:space="preserve">While paused, no as-it-happens, digest, emergency alert or media list email leaves News On Demand. Confirmation emails to people signing up still go out.</w:t>
+      </w:r>
+    </w:p>
+    <w:p>
+      <w:pPr>
+        <w:spacing w:after="120"/>
+      </w:pPr>
+      <w:r>
+        <w:t xml:space="preserve">To resume:</w:t>
+      </w:r>
+    </w:p>
+    <w:p>
+      <w:pPr>
+        <w:pStyle w:val="ListParagraph"/>
+        <w:numPr>
+          <w:ilvl w:val="0"/>
           <w:numId w:val="17"/>
         </w:numPr>
       </w:pPr>
       <w:r>
+        <w:t xml:space="preserve">Choose </w:t>
+      </w:r>
+      <w:r>
+        <w:rPr>
+          <w:b/>
+          <w:bCs/>
+        </w:rPr>
+        <w:t xml:space="preserve">Resume News On Demand sending</w:t>
+      </w:r>
+      <w:r>
+        <w:t xml:space="preserve">. The Hub asks "Resume News On Demand sending?" and says how much goes out straight away, counted as you open the question, for example "1,205 held emails for 3 releases start going out straight away. The oldest has waited 12 days, since …". When nothing is held, it says "Nothing is held, so nothing goes out straight away."</w:t>
+      </w:r>
+    </w:p>
+    <w:p>
+      <w:pPr>
+        <w:pStyle w:val="ListParagraph"/>
+        <w:numPr>
+          <w:ilvl w:val="0"/>
+          <w:numId w:val="17"/>
+        </w:numPr>
+      </w:pPr>
+      <w:r>
+        <w:t xml:space="preserve">Choose </w:t>
+      </w:r>
+      <w:r>
+        <w:rPr>
+          <w:b/>
+          <w:bCs/>
+        </w:rPr>
+        <w:t xml:space="preserve">Confirm resume</w:t>
+      </w:r>
+      <w:r>
+        <w:t xml:space="preserve">. You see how much was actually released, for example "News On Demand sending resumed. 1,205 held emails for 3 releases are going out now." To cancel some held email first, choose </w:t>
+      </w:r>
+      <w:r>
+        <w:rPr>
+          <w:b/>
+          <w:bCs/>
+        </w:rPr>
+        <w:t xml:space="preserve">Cancel</w:t>
+      </w:r>
+      <w:r>
+        <w:t xml:space="preserve"> instead and use </w:t>
+      </w:r>
+      <w:r>
+        <w:rPr>
+          <w:b/>
+          <w:bCs/>
+        </w:rPr>
+        <w:t xml:space="preserve">Outgoing news email</w:t>
+      </w:r>
+      <w:r>
+        <w:t xml:space="preserve">, below.</w:t>
+      </w:r>
+    </w:p>
+    <w:p>
+      <w:pPr>
+        <w:pStyle w:val="Heading2"/>
+      </w:pPr>
+      <w:r>
+        <w:t xml:space="preserve">Pause Distribution</w:t>
+      </w:r>
+    </w:p>
+    <w:p>
+      <w:pPr>
+        <w:spacing w:after="120"/>
+      </w:pPr>
+      <w:r>
+        <w:t xml:space="preserve">Distribution is the service that sends email for every app. Pause it only when email from all of them must stop.</w:t>
+      </w:r>
+    </w:p>
+    <w:p>
+      <w:pPr>
+        <w:pStyle w:val="ListParagraph"/>
+        <w:numPr>
+          <w:ilvl w:val="0"/>
+          <w:numId w:val="18"/>
+        </w:numPr>
+      </w:pPr>
+      <w:r>
         <w:t xml:space="preserve">Under </w:t>
       </w:r>
       <w:r>
@@ -5628,7 +6105,7 @@
           <w:b/>
           <w:bCs/>
         </w:rPr>
-        <w:t xml:space="preserve">News On Demand sending</w:t>
+        <w:t xml:space="preserve">Distribution</w:t>
       </w:r>
       <w:r>
         <w:t xml:space="preserve">, choose </w:t>
@@ -5638,18 +6115,18 @@
           <w:b/>
           <w:bCs/>
         </w:rPr>
-        <w:t xml:space="preserve">Pause News On Demand sending</w:t>
-      </w:r>
-      <w:r>
-        <w:t xml:space="preserve">. The Hub asks "Pause News On Demand sending?" and explains "News On Demand keeps recording releases and building emails but holds them until you resume. Nothing is dropped." and says who is emailed about it.</w:t>
-      </w:r>
-    </w:p>
-    <w:p>
-      <w:pPr>
-        <w:pStyle w:val="ListParagraph"/>
-        <w:numPr>
-          <w:ilvl w:val="0"/>
-          <w:numId w:val="17"/>
+        <w:t xml:space="preserve">Pause Distribution</w:t>
+      </w:r>
+      <w:r>
+        <w:t xml:space="preserve">. The Hub asks "Pause Distribution?" and explains "No email goes out from any app, except system notices, until you resume. Queued email is kept." and says who is emailed about it.</w:t>
+      </w:r>
+    </w:p>
+    <w:p>
+      <w:pPr>
+        <w:pStyle w:val="ListParagraph"/>
+        <w:numPr>
+          <w:ilvl w:val="0"/>
+          <w:numId w:val="18"/>
         </w:numPr>
       </w:pPr>
       <w:r>
@@ -5663,14 +6140,190 @@
         <w:t xml:space="preserve">Confirm pause</w:t>
       </w:r>
       <w:r>
-        <w:t xml:space="preserve">. You see "News On Demand sending paused." and the section shows </w:t>
-      </w:r>
-      <w:r>
-        <w:rPr>
-          <w:b/>
-          <w:bCs/>
-        </w:rPr>
-        <w:t xml:space="preserve">Paused</w:t>
+        <w:t xml:space="preserve">. You see "Distribution paused."</w:t>
+      </w:r>
+    </w:p>
+    <w:p>
+      <w:pPr>
+        <w:spacing w:after="120"/>
+      </w:pPr>
+      <w:r>
+        <w:t xml:space="preserve">System notices still go out while paused. These include sign-up confirmations, manage-subscription links, the bounce summary and the pause emails themselves.</w:t>
+      </w:r>
+    </w:p>
+    <w:p>
+      <w:pPr>
+        <w:spacing w:after="120"/>
+      </w:pPr>
+      <w:r>
+        <w:t xml:space="preserve">To resume, choose </w:t>
+      </w:r>
+      <w:r>
+        <w:rPr>
+          <w:b/>
+          <w:bCs/>
+        </w:rPr>
+        <w:t xml:space="preserve">Resume Distribution</w:t>
+      </w:r>
+      <w:r>
+        <w:t xml:space="preserve">, then </w:t>
+      </w:r>
+      <w:r>
+        <w:rPr>
+          <w:b/>
+          <w:bCs/>
+        </w:rPr>
+        <w:t xml:space="preserve">Confirm resume</w:t>
+      </w:r>
+      <w:r>
+        <w:t xml:space="preserve">. The Hub warns that queued email starts going out straight away.</w:t>
+      </w:r>
+    </w:p>
+    <w:p>
+      <w:pPr>
+        <w:pStyle w:val="Heading2"/>
+      </w:pPr>
+      <w:r>
+        <w:t xml:space="preserve">Outgoing news email</w:t>
+      </w:r>
+    </w:p>
+    <w:p>
+      <w:pPr>
+        <w:spacing w:after="120"/>
+      </w:pPr>
+      <w:r>
+        <w:t xml:space="preserve">This section shows news email that hasn't gone out yet, and news email that failed.</w:t>
+      </w:r>
+    </w:p>
+    <w:p>
+      <w:pPr>
+        <w:spacing w:after="120"/>
+      </w:pPr>
+      <w:r>
+        <w:t xml:space="preserve">While News On Demand sending is paused, it says how much is held, for example "Held while paused: 1,205 emails for 3 releases. The oldest has waited 12 days, since …". The </w:t>
+      </w:r>
+      <w:r>
+        <w:rPr>
+          <w:b/>
+          <w:bCs/>
+        </w:rPr>
+        <w:t xml:space="preserve">Held news email</w:t>
+      </w:r>
+      <w:r>
+        <w:t xml:space="preserve"> table has one row per release and type: </w:t>
+      </w:r>
+      <w:r>
+        <w:rPr>
+          <w:b/>
+          <w:bCs/>
+        </w:rPr>
+        <w:t xml:space="preserve">As it happens</w:t>
+      </w:r>
+      <w:r>
+        <w:t xml:space="preserve">, </w:t>
+      </w:r>
+      <w:r>
+        <w:rPr>
+          <w:b/>
+          <w:bCs/>
+        </w:rPr>
+        <w:t xml:space="preserve">Media list</w:t>
+      </w:r>
+      <w:r>
+        <w:t xml:space="preserve">, </w:t>
+      </w:r>
+      <w:r>
+        <w:rPr>
+          <w:b/>
+          <w:bCs/>
+        </w:rPr>
+        <w:t xml:space="preserve">Emergency alert</w:t>
+      </w:r>
+      <w:r>
+        <w:t xml:space="preserve">, or </w:t>
+      </w:r>
+      <w:r>
+        <w:rPr>
+          <w:b/>
+          <w:bCs/>
+        </w:rPr>
+        <w:t xml:space="preserve">Daily digest</w:t>
+      </w:r>
+      <w:r>
+        <w:t xml:space="preserve"> (one row per daily digest, with how many releases it carries). </w:t>
+      </w:r>
+      <w:r>
+        <w:rPr>
+          <w:b/>
+          <w:bCs/>
+        </w:rPr>
+        <w:t xml:space="preserve">Emails</w:t>
+      </w:r>
+      <w:r>
+        <w:t xml:space="preserve"> counts the active subscribers it would still go to, leaving out anyone an earlier try already reached. </w:t>
+      </w:r>
+      <w:r>
+        <w:rPr>
+          <w:b/>
+          <w:bCs/>
+        </w:rPr>
+        <w:t xml:space="preserve">Note</w:t>
+      </w:r>
+      <w:r>
+        <w:t xml:space="preserve"> shows when an email has already been tried and what went wrong.</w:t>
+      </w:r>
+    </w:p>
+    <w:p>
+      <w:pPr>
+        <w:spacing w:after="120"/>
+      </w:pPr>
+      <w:r>
+        <w:t xml:space="preserve">While sending is running, the section normally says "Nothing is waiting to go out." Anything listed is waiting to be tried again.</w:t>
+      </w:r>
+    </w:p>
+    <w:p>
+      <w:pPr>
+        <w:pStyle w:val="Heading3"/>
+      </w:pPr>
+      <w:r>
+        <w:t xml:space="preserve">Before you resume after a long pause</w:t>
+      </w:r>
+    </w:p>
+    <w:p>
+      <w:pPr>
+        <w:spacing w:after="120"/>
+      </w:pPr>
+      <w:r>
+        <w:t xml:space="preserve">Everything held goes out when you resume, however old it is. After a long pause, decide first whether old releases should still be sent, and cancel the ones that shouldn't:</w:t>
+      </w:r>
+    </w:p>
+    <w:p>
+      <w:pPr>
+        <w:pStyle w:val="ListParagraph"/>
+        <w:numPr>
+          <w:ilvl w:val="0"/>
+          <w:numId w:val="19"/>
+        </w:numPr>
+      </w:pPr>
+      <w:r>
+        <w:t xml:space="preserve">Choose </w:t>
+      </w:r>
+      <w:r>
+        <w:rPr>
+          <w:b/>
+          <w:bCs/>
+        </w:rPr>
+        <w:t xml:space="preserve">Cancel</w:t>
+      </w:r>
+      <w:r>
+        <w:t xml:space="preserve"> on a release's row, or </w:t>
+      </w:r>
+      <w:r>
+        <w:rPr>
+          <w:b/>
+          <w:bCs/>
+        </w:rPr>
+        <w:t xml:space="preserve">Cancel all held email</w:t>
       </w:r>
       <w:r>
         <w:t xml:space="preserve">.</w:t>
@@ -5678,94 +6331,22 @@
     </w:p>
     <w:p>
       <w:pPr>
-        <w:spacing w:after="120"/>
-      </w:pPr>
-      <w:r>
-        <w:t xml:space="preserve">While paused, no as-it-happens, digest, emergency alert or media list email leaves News On Demand. Confirmation emails to people signing up still go out.</w:t>
-      </w:r>
-    </w:p>
-    <w:p>
-      <w:pPr>
-        <w:spacing w:after="120"/>
-      </w:pPr>
-      <w:r>
-        <w:t xml:space="preserve">To resume, choose </w:t>
-      </w:r>
-      <w:r>
-        <w:rPr>
-          <w:b/>
-          <w:bCs/>
-        </w:rPr>
-        <w:t xml:space="preserve">Resume News On Demand sending</w:t>
-      </w:r>
-      <w:r>
-        <w:t xml:space="preserve">, then </w:t>
-      </w:r>
-      <w:r>
-        <w:rPr>
-          <w:b/>
-          <w:bCs/>
-        </w:rPr>
-        <w:t xml:space="preserve">Confirm resume</w:t>
-      </w:r>
-      <w:r>
-        <w:t xml:space="preserve">. The Hub warns that held emails start going out straight away.</w:t>
-      </w:r>
-    </w:p>
-    <w:p>
-      <w:pPr>
-        <w:pStyle w:val="Heading2"/>
-      </w:pPr>
-      <w:r>
-        <w:t xml:space="preserve">Pause Distribution</w:t>
-      </w:r>
-    </w:p>
-    <w:p>
-      <w:pPr>
-        <w:spacing w:after="120"/>
-      </w:pPr>
-      <w:r>
-        <w:t xml:space="preserve">Distribution is the service that sends email for every app. Pause it only when email from all of them must stop.</w:t>
-      </w:r>
-    </w:p>
-    <w:p>
-      <w:pPr>
-        <w:pStyle w:val="ListParagraph"/>
-        <w:numPr>
-          <w:ilvl w:val="0"/>
-          <w:numId w:val="18"/>
-        </w:numPr>
-      </w:pPr>
-      <w:r>
-        <w:t xml:space="preserve">Under </w:t>
-      </w:r>
-      <w:r>
-        <w:rPr>
-          <w:b/>
-          <w:bCs/>
-        </w:rPr>
-        <w:t xml:space="preserve">Distribution</w:t>
-      </w:r>
-      <w:r>
-        <w:t xml:space="preserve">, choose </w:t>
-      </w:r>
-      <w:r>
-        <w:rPr>
-          <w:b/>
-          <w:bCs/>
-        </w:rPr>
-        <w:t xml:space="preserve">Pause Distribution</w:t>
-      </w:r>
-      <w:r>
-        <w:t xml:space="preserve">. The Hub asks "Pause Distribution?" and explains "No email goes out from any app, except system notices, until you resume. Queued email is kept." and says who is emailed about it.</w:t>
-      </w:r>
-    </w:p>
-    <w:p>
-      <w:pPr>
-        <w:pStyle w:val="ListParagraph"/>
-        <w:numPr>
-          <w:ilvl w:val="0"/>
-          <w:numId w:val="18"/>
+        <w:pStyle w:val="ListParagraph"/>
+        <w:numPr>
+          <w:ilvl w:val="0"/>
+          <w:numId w:val="19"/>
+        </w:numPr>
+      </w:pPr>
+      <w:r>
+        <w:t xml:space="preserve">The Hub asks "Cancel held email?", says how many emails for how many releases won't be sent, and lists each one. If emergency alerts are among them, it adds, for example, "This includes 1 emergency alert."</w:t>
+      </w:r>
+    </w:p>
+    <w:p>
+      <w:pPr>
+        <w:pStyle w:val="ListParagraph"/>
+        <w:numPr>
+          <w:ilvl w:val="0"/>
+          <w:numId w:val="19"/>
         </w:numPr>
       </w:pPr>
       <w:r>
@@ -5776,62 +6357,92 @@
           <w:b/>
           <w:bCs/>
         </w:rPr>
-        <w:t xml:space="preserve">Confirm pause</w:t>
-      </w:r>
-      <w:r>
-        <w:t xml:space="preserve">. You see "Distribution paused."</w:t>
-      </w:r>
-    </w:p>
-    <w:p>
-      <w:pPr>
-        <w:spacing w:after="120"/>
-      </w:pPr>
-      <w:r>
-        <w:t xml:space="preserve">System notices still go out while paused. These include sign-up confirmations, manage-subscription links, the bounce summary and the pause emails themselves.</w:t>
-      </w:r>
-    </w:p>
-    <w:p>
-      <w:pPr>
-        <w:spacing w:after="120"/>
-      </w:pPr>
-      <w:r>
-        <w:t xml:space="preserve">To resume, choose </w:t>
-      </w:r>
-      <w:r>
-        <w:rPr>
-          <w:b/>
-          <w:bCs/>
-        </w:rPr>
-        <w:t xml:space="preserve">Resume Distribution</w:t>
-      </w:r>
-      <w:r>
-        <w:t xml:space="preserve">, then </w:t>
-      </w:r>
-      <w:r>
-        <w:rPr>
-          <w:b/>
-          <w:bCs/>
-        </w:rPr>
-        <w:t xml:space="preserve">Confirm resume</w:t>
-      </w:r>
-      <w:r>
-        <w:t xml:space="preserve">. The Hub warns that queued email starts going out straight away.</w:t>
-      </w:r>
-    </w:p>
-    <w:p>
-      <w:pPr>
-        <w:pStyle w:val="Heading2"/>
-      </w:pPr>
-      <w:r>
-        <w:t xml:space="preserve">Before you resume after a long pause</w:t>
-      </w:r>
-    </w:p>
-    <w:p>
-      <w:pPr>
-        <w:spacing w:after="120"/>
-      </w:pPr>
-      <w:r>
-        <w:t xml:space="preserve">Everything held goes out when you resume, however old it is. After a long pause, decide first whether old releases should still be sent. An email held more than 24 hours that then fails to send is not tried again.</w:t>
+        <w:t xml:space="preserve">Cancel held email</w:t>
+      </w:r>
+      <w:r>
+        <w:t xml:space="preserve">. You see, for example, "Cancelled 1,200 held emails." If some had already started going out just before the pause, the message adds "Some had already started going out, so they weren’t cancelled." To keep them, choose </w:t>
+      </w:r>
+      <w:r>
+        <w:rPr>
+          <w:b/>
+          <w:bCs/>
+        </w:rPr>
+        <w:t xml:space="preserve">Keep it</w:t>
+      </w:r>
+      <w:r>
+        <w:t xml:space="preserve">.</w:t>
+      </w:r>
+    </w:p>
+    <w:p>
+      <w:pPr>
+        <w:spacing w:after="120"/>
+      </w:pPr>
+      <w:r>
+        <w:t xml:space="preserve">Each cancel is recorded with your name and the releases and daily digests it cancelled.</w:t>
+      </w:r>
+    </w:p>
+    <w:p>
+      <w:pPr>
+        <w:spacing w:after="120"/>
+      </w:pPr>
+      <w:r>
+        <w:t xml:space="preserve">Cancelled email is never sent, and this can't be undone. If an editor later unpublishes the release and publishes it again, it is emailed again as a new release. On </w:t>
+      </w:r>
+      <w:r>
+        <w:rPr>
+          <w:b/>
+          <w:bCs/>
+        </w:rPr>
+        <w:t xml:space="preserve">Sends per release</w:t>
+      </w:r>
+      <w:r>
+        <w:t xml:space="preserve">, cancelled as-it-happens and media list emails count as </w:t>
+      </w:r>
+      <w:r>
+        <w:rPr>
+          <w:b/>
+          <w:bCs/>
+        </w:rPr>
+        <w:t xml:space="preserve">Not sent</w:t>
+      </w:r>
+      <w:r>
+        <w:t xml:space="preserve">; a cancelled daily digest is left out of </w:t>
+      </w:r>
+      <w:r>
+        <w:rPr>
+          <w:b/>
+          <w:bCs/>
+        </w:rPr>
+        <w:t xml:space="preserve">Daily digest runs</w:t>
+      </w:r>
+      <w:r>
+        <w:t xml:space="preserve">. You can cancel only while News On Demand sending is paused. If someone resumed it meanwhile, you see "News On Demand sending isn’t paused, so nothing was cancelled. Pause it first."</w:t>
+      </w:r>
+    </w:p>
+    <w:p>
+      <w:pPr>
+        <w:pStyle w:val="Heading3"/>
+      </w:pPr>
+      <w:r>
+        <w:t xml:space="preserve">Failed in the last 30 days</w:t>
+      </w:r>
+    </w:p>
+    <w:p>
+      <w:pPr>
+        <w:spacing w:after="120"/>
+      </w:pPr>
+      <w:r>
+        <w:t xml:space="preserve">News email that Distribution refused, or that kept failing for 24 hours, is listed under </w:t>
+      </w:r>
+      <w:r>
+        <w:rPr>
+          <w:b/>
+          <w:bCs/>
+        </w:rPr>
+        <w:t xml:space="preserve">Failed in the last 30 days</w:t>
+      </w:r>
+      <w:r>
+        <w:t xml:space="preserve"> with how many emails weren't sent and what went wrong. An email held more than 24 hours that then fails to send is not tried again. Failed email isn't sent again by itself: ask technical support to look at the error. When nothing failed, you see "No news email failed in the last 30 days."</w:t>
       </w:r>
     </w:p>
     <w:p>
@@ -5919,7 +6530,7 @@
         <w:pStyle w:val="ListParagraph"/>
         <w:numPr>
           <w:ilvl w:val="0"/>
-          <w:numId w:val="19"/>
+          <w:numId w:val="20"/>
         </w:numPr>
       </w:pPr>
       <w:r>
@@ -5941,7 +6552,7 @@
         <w:pStyle w:val="ListParagraph"/>
         <w:numPr>
           <w:ilvl w:val="0"/>
-          <w:numId w:val="19"/>
+          <w:numId w:val="20"/>
         </w:numPr>
       </w:pPr>
       <w:r>
@@ -5997,7 +6608,7 @@
         <w:pStyle w:val="ListParagraph"/>
         <w:numPr>
           <w:ilvl w:val="0"/>
-          <w:numId w:val="20"/>
+          <w:numId w:val="21"/>
         </w:numPr>
       </w:pPr>
       <w:r>
@@ -6019,7 +6630,7 @@
         <w:pStyle w:val="ListParagraph"/>
         <w:numPr>
           <w:ilvl w:val="0"/>
-          <w:numId w:val="20"/>
+          <w:numId w:val="21"/>
         </w:numPr>
       </w:pPr>
       <w:r>
@@ -6154,7 +6765,7 @@
         <w:pStyle w:val="ListParagraph"/>
         <w:numPr>
           <w:ilvl w:val="0"/>
-          <w:numId w:val="21"/>
+          <w:numId w:val="22"/>
         </w:numPr>
       </w:pPr>
       <w:r>
@@ -6176,7 +6787,7 @@
         <w:pStyle w:val="ListParagraph"/>
         <w:numPr>
           <w:ilvl w:val="0"/>
-          <w:numId w:val="21"/>
+          <w:numId w:val="22"/>
         </w:numPr>
       </w:pPr>
       <w:r>
@@ -6258,7 +6869,7 @@
         <w:pStyle w:val="ListParagraph"/>
         <w:numPr>
           <w:ilvl w:val="0"/>
-          <w:numId w:val="22"/>
+          <w:numId w:val="23"/>
         </w:numPr>
       </w:pPr>
       <w:r>
@@ -6290,7 +6901,7 @@
         <w:pStyle w:val="ListParagraph"/>
         <w:numPr>
           <w:ilvl w:val="0"/>
-          <w:numId w:val="22"/>
+          <w:numId w:val="23"/>
         </w:numPr>
       </w:pPr>
       <w:r>
@@ -7484,6 +8095,21 @@
     </w:lvlOverride>
   </w:num>
   <w:num w:numId="22">
+    <w:abstractNumId w:val="3"/>
+    <w:lvlOverride w:ilvl="0">
+      <w:startOverride w:val="1"/>
+    </w:lvlOverride>
+    <w:lvlOverride w:ilvl="1">
+      <w:startOverride w:val="1"/>
+    </w:lvlOverride>
+    <w:lvlOverride w:ilvl="2">
+      <w:startOverride w:val="1"/>
+    </w:lvlOverride>
+    <w:lvlOverride w:ilvl="3">
+      <w:startOverride w:val="1"/>
+    </w:lvlOverride>
+  </w:num>
+  <w:num w:numId="23">
     <w:abstractNumId w:val="3"/>
     <w:lvlOverride w:ilvl="0">
       <w:startOverride w:val="1"/>

</xml_diff>

<commit_message>
1230d6a15648468440077efe002ed51ee7dad558 deploy: siteground artifact
</commit_message>
<xml_diff>
--- a/hub/manuals/nod-admin.docx
+++ b/hub/manuals/nod-admin.docx
@@ -937,7 +937,7 @@
         <w:spacing w:after="120"/>
       </w:pPr>
       <w:r>
-        <w:t xml:space="preserve">A correction to a release never emails anyone again. If a release is unpublished, anything not yet sent is stopped, and daily digests leave it out while it is off the site. If it is published again before 5:00 pm on the day it first went out (the next day if it first went out after 5:00 pm), that digest still carries it.</w:t>
+        <w:t xml:space="preserve">A correction to a release emails nobody again unless the release editor chooses to. They can email it again to the people who already got it: subscribers, media list members or both. Those people get the corrected release with "Corrected:" before the subject, one copy each; nobody new is emailed. If a release is unpublished, anything not yet sent is stopped, and daily digests leave it out while it is off the site. If it is published again before 5:00 pm on the day it first went out (the next day if it first went out after 5:00 pm), that digest still carries it.</w:t>
       </w:r>
     </w:p>
     <w:p>
@@ -5317,7 +5317,7 @@
         <w:tc>
           <w:p>
             <w:r>
-              <w:t xml:space="preserve">For each release or alert published in the dates you choose, the as-it-happens and media list emails.</w:t>
+              <w:t xml:space="preserve">For each release or alert published in the dates you choose, the as-it-happens and media list emails, and any corrected copies a release editor emailed again.</w:t>
             </w:r>
           </w:p>
         </w:tc>
@@ -6240,7 +6240,7 @@
         <w:t xml:space="preserve">Emergency alert</w:t>
       </w:r>
       <w:r>
-        <w:t xml:space="preserve">, or </w:t>
+        <w:t xml:space="preserve">, </w:t>
       </w:r>
       <w:r>
         <w:rPr>
@@ -6250,7 +6250,27 @@
         <w:t xml:space="preserve">Daily digest</w:t>
       </w:r>
       <w:r>
-        <w:t xml:space="preserve"> (one row per daily digest, with how many releases it carries). </w:t>
+        <w:t xml:space="preserve"> (one row per daily digest, with how many releases it carries), or </w:t>
+      </w:r>
+      <w:r>
+        <w:rPr>
+          <w:b/>
+          <w:bCs/>
+        </w:rPr>
+        <w:t xml:space="preserve">Corrected copy to subscribers</w:t>
+      </w:r>
+      <w:r>
+        <w:t xml:space="preserve"> and </w:t>
+      </w:r>
+      <w:r>
+        <w:rPr>
+          <w:b/>
+          <w:bCs/>
+        </w:rPr>
+        <w:t xml:space="preserve">Corrected copy to media lists</w:t>
+      </w:r>
+      <w:r>
+        <w:t xml:space="preserve"> (a corrected release a release editor chose to email again to the people who already got it). </w:t>
       </w:r>
       <w:r>
         <w:rPr>

</xml_diff>

<commit_message>
26189949917404cfa72afe09050233f3e4804d6a deploy: siteground artifact
</commit_message>
<xml_diff>
--- a/hub/manuals/nod-admin.docx
+++ b/hub/manuals/nod-admin.docx
@@ -6570,7 +6570,27 @@
         <w:spacing w:after="120"/>
       </w:pPr>
       <w:r>
-        <w:t xml:space="preserve">Each cancel is recorded with your name and the releases and daily digests it cancelled.</w:t>
+        <w:t xml:space="preserve">Each cancel is recorded with your name and the releases and daily digests it cancelled. </w:t>
+      </w:r>
+      <w:r>
+        <w:rPr>
+          <w:b/>
+          <w:bCs/>
+        </w:rPr>
+        <w:t xml:space="preserve">Cancel all held email</w:t>
+      </w:r>
+      <w:r>
+        <w:t xml:space="preserve"> works however much is held. If some of that email went out or was cancelled after the page loaded, you see "Some of this email went out or was cancelled since this page loaded, so nothing was cancelled." Choose </w:t>
+      </w:r>
+      <w:r>
+        <w:rPr>
+          <w:b/>
+          <w:bCs/>
+        </w:rPr>
+        <w:t xml:space="preserve">Keep it</w:t>
+      </w:r>
+      <w:r>
+        <w:t xml:space="preserve">, check the updated list and try again.</w:t>
       </w:r>
     </w:p>
     <w:p>

</xml_diff>

<commit_message>
cc2e394ea97abde5122765100c0e2d4a03cfc644 deploy: siteground artifact
</commit_message>
<xml_diff>
--- a/hub/manuals/nod-admin.docx
+++ b/hub/manuals/nod-admin.docx
@@ -2481,7 +2481,39 @@
         </w:numPr>
       </w:pPr>
       <w:r>
-        <w:t xml:space="preserve">Read the question, then choose </w:t>
+        <w:t xml:space="preserve">Read the question. For </w:t>
+      </w:r>
+      <w:r>
+        <w:rPr>
+          <w:b/>
+          <w:bCs/>
+        </w:rPr>
+        <w:t xml:space="preserve">Delete selected</w:t>
+      </w:r>
+      <w:r>
+        <w:t xml:space="preserve">, also choose an answer under </w:t>
+      </w:r>
+      <w:r>
+        <w:rPr>
+          <w:b/>
+          <w:bCs/>
+        </w:rPr>
+        <w:t xml:space="preserve">Why are you deleting them?</w:t>
+      </w:r>
+      <w:r>
+        <w:t xml:space="preserve">, the same two choices as on a record. Your answer applies to every ticked person, so tick only people who share the same reason.</w:t>
+      </w:r>
+    </w:p>
+    <w:p>
+      <w:pPr>
+        <w:pStyle w:val="ListParagraph"/>
+        <w:numPr>
+          <w:ilvl w:val="0"/>
+          <w:numId w:val="6"/>
+        </w:numPr>
+      </w:pPr>
+      <w:r>
+        <w:t xml:space="preserve">Choose </w:t>
       </w:r>
       <w:r>
         <w:rPr>
@@ -2526,17 +2558,27 @@
         <w:t xml:space="preserve">Delete selected</w:t>
       </w:r>
       <w:r>
-        <w:t xml:space="preserve"> is always the </w:t>
-      </w:r>
-      <w:r>
-        <w:rPr>
-          <w:b/>
-          <w:bCs/>
-        </w:rPr>
-        <w:t xml:space="preserve">Something else</w:t>
-      </w:r>
-      <w:r>
-        <w:t xml:space="preserve"> kind of delete. If a person asked to stop their email, delete them from their own record and choose </w:t>
+        <w:t xml:space="preserve"> does to each person exactly what </w:t>
+      </w:r>
+      <w:r>
+        <w:rPr>
+          <w:b/>
+          <w:bCs/>
+        </w:rPr>
+        <w:t xml:space="preserve">Delete</w:t>
+      </w:r>
+      <w:r>
+        <w:t xml:space="preserve"> does on their record, for the reason you chose. See </w:t>
+      </w:r>
+      <w:r>
+        <w:rPr>
+          <w:b/>
+          <w:bCs/>
+        </w:rPr>
+        <w:t xml:space="preserve">Delete someone</w:t>
+      </w:r>
+      <w:r>
+        <w:t xml:space="preserve"> above. For example, choose </w:t>
       </w:r>
       <w:r>
         <w:rPr>
@@ -2546,7 +2588,7 @@
         <w:t xml:space="preserve">They asked us to stop sending them email</w:t>
       </w:r>
       <w:r>
-        <w:t xml:space="preserve">, so it's kept as their unsubscribe.</w:t>
+        <w:t xml:space="preserve"> when several people wrote in to say stop, and each one is kept as an unsubscribe.</w:t>
       </w:r>
     </w:p>
     <w:p>

</xml_diff>